<commit_message>
feat: add proposal application component and documentation files for kopi jodi ecosystem
</commit_message>
<xml_diff>
--- a/Rekomendasi_Solusi_Teknologi_Kopi_Seduhan_Jodi.docx
+++ b/Rekomendasi_Solusi_Teknologi_Kopi_Seduhan_Jodi.docx
@@ -2058,7 +2058,93 @@
           <w:color w:val="4A2E18"/>
           <w:sz w:val="23"/>
         </w:rPr>
-        <w:t>Fitur Kunci Pengendalian Biaya &amp; Stok (ERP Core):</w:t>
+        <w:t>Fitur Kunci ERP Backoffice &amp; Finance (Fase 1 Core):</w:t>
+      </w:r>
+    </w:p>
+    <w:tbl>
+      <w:tblPr>
+        <w:tblW w:type="auto" w:w="0"/>
+        <w:jc w:val="center"/>
+        <w:tblLayout w:type="fixed"/>
+        <w:tblLook w:firstColumn="1" w:firstRow="1" w:lastColumn="0" w:lastRow="0" w:noHBand="0" w:noVBand="1" w:val="04A0"/>
+      </w:tblPr>
+      <w:tblGrid>
+        <w:gridCol w:w="9029"/>
+      </w:tblGrid>
+      <w:tr>
+        <w:tc>
+          <w:tcPr>
+            <w:tcW w:type="dxa" w:w="9029"/>
+            <w:shd w:fill="EEF2FF"/>
+            <w:tcMar>
+              <w:top w:w="120" w:type="dxa"/>
+              <w:bottom w:w="120" w:type="dxa"/>
+              <w:left w:w="160" w:type="dxa"/>
+              <w:right w:w="140" w:type="dxa"/>
+            </w:tcMar>
+            <w:tcBorders>
+              <w:top w:val="none"/>
+              <w:left w:val="single" w:sz="24" w:space="0" w:color="4F46E5"/>
+              <w:bottom w:val="none"/>
+              <w:right w:val="none"/>
+            </w:tcBorders>
+          </w:tcPr>
+          <w:p>
+            <w:pPr>
+              <w:spacing w:before="40" w:after="60" w:line="276" w:lineRule="auto"/>
+            </w:pPr>
+            <w:r>
+              <w:rPr>
+                <w:rFonts w:ascii="Segoe UI" w:hAnsi="Segoe UI"/>
+                <w:b/>
+                <w:color w:val="3E2723"/>
+                <w:sz w:val="20"/>
+              </w:rPr>
+              <w:t>Alur Utama ERP Core:</w:t>
+            </w:r>
+          </w:p>
+          <w:p>
+            <w:pPr>
+              <w:spacing w:before="20" w:after="40" w:line="276" w:lineRule="auto"/>
+            </w:pPr>
+            <w:r>
+              <w:rPr>
+                <w:rFonts w:ascii="Segoe UI" w:hAnsi="Segoe UI"/>
+                <w:color w:val="374151"/>
+                <w:sz w:val="19"/>
+              </w:rPr>
+              <w:t>Pesan Barang → Terima Barang → Input Nota → HPP Terkoreksi → Laporan Keuangan</w:t>
+            </w:r>
+          </w:p>
+        </w:tc>
+      </w:tr>
+    </w:tbl>
+    <w:p>
+      <w:pPr>
+        <w:spacing w:after="80"/>
+      </w:pPr>
+    </w:p>
+    <w:p>
+      <w:pPr>
+        <w:pStyle w:val="ListBullet"/>
+        <w:spacing w:before="20" w:after="40" w:line="276" w:lineRule="auto"/>
+      </w:pPr>
+      <w:r>
+        <w:rPr>
+          <w:rFonts w:ascii="Segoe UI" w:hAnsi="Segoe UI"/>
+          <w:b/>
+          <w:color w:val="1F2937"/>
+          <w:sz w:val="18"/>
+        </w:rPr>
+        <w:t xml:space="preserve">1. Stok Terpisah per Outlet, Terpantau Terpusat: </w:t>
+      </w:r>
+      <w:r>
+        <w:rPr>
+          <w:rFonts w:ascii="Segoe UI" w:hAnsi="Segoe UI"/>
+          <w:color w:val="374151"/>
+          <w:sz w:val="18"/>
+        </w:rPr>
+        <w:t>Stok tiap outlet tercatat di satu sistem. Bertambah saat barang diterima di outlet dan berkurang otomatis sesuai resep setiap minuman terjual. Pusat memantau semua outlet secara live dengan peringatan stok menipis, sedangkan tiap outlet hanya melihat stoknya sendiri.</w:t>
       </w:r>
     </w:p>
     <w:p>
@@ -2073,7 +2159,7 @@
           <w:color w:val="1F2937"/>
           <w:sz w:val="18"/>
         </w:rPr>
-        <w:t xml:space="preserve">Potong Stok Resep Otomatis: </w:t>
+        <w:t xml:space="preserve">2. Pemesanan Barang Tanpa Harga: </w:t>
       </w:r>
       <w:r>
         <w:rPr>
@@ -2081,7 +2167,7 @@
           <w:color w:val="374151"/>
           <w:sz w:val="18"/>
         </w:rPr>
-        <w:t>Tiap transaksi kasir langsung memotong gramatur kopi, ml susu, sirup, dan cup secara otomatis.</w:t>
+        <w:t>Outlet memesan ke gudang pusat cukup dengan jenis dan jumlah barang. Saat barang diterima, stok langsung bertambah dengan status “menunggu nota”.</w:t>
       </w:r>
     </w:p>
     <w:p>
@@ -2096,7 +2182,7 @@
           <w:color w:val="1F2937"/>
           <w:sz w:val="18"/>
         </w:rPr>
-        <w:t xml:space="preserve">Alur Pembelian Transparan (True-Up HPP): </w:t>
+        <w:t xml:space="preserve">3. Koreksi HPP Otomatis (True-Up HPP): </w:t>
       </w:r>
       <w:r>
         <w:rPr>
@@ -2104,7 +2190,7 @@
           <w:color w:val="374151"/>
           <w:sz w:val="18"/>
         </w:rPr>
-        <w:t>Request bahan (tanpa harga) -&gt; Terima barang fisik -&gt; Upload foto bon -&gt; Finance verifikasi -&gt; HPP riil terkoreksi otomatis.</w:t>
+        <w:t>Modal sementara memakai harga terakhir, lalu dikoreksi otomatis saat nota supplier diinput, sehingga laporan margin selalu akurat.</w:t>
       </w:r>
     </w:p>
     <w:p>
@@ -2119,7 +2205,7 @@
           <w:color w:val="1F2937"/>
           <w:sz w:val="18"/>
         </w:rPr>
-        <w:t xml:space="preserve">Approval Kas Kecil Berjenjang: </w:t>
+        <w:t xml:space="preserve">4. Resep, Bahan &amp; Menu: </w:t>
       </w:r>
       <w:r>
         <w:rPr>
@@ -2127,7 +2213,7 @@
           <w:color w:val="374151"/>
           <w:sz w:val="18"/>
         </w:rPr>
-        <w:t>Nominal kecil (Store Manager), nominal menengah (Finance), nominal besar (Owner) wajib lampirkan foto bon.</w:t>
+        <w:t>Master 25+ bahan baku dan kemasan, resep racikan (BOM) yang menghitung modal per gelas, bahan olahan seperti sirup dan cold brew, serta menu khusus outlet yang disetujui pusat.</w:t>
       </w:r>
     </w:p>
     <w:p>
@@ -2142,7 +2228,7 @@
           <w:color w:val="1F2937"/>
           <w:sz w:val="18"/>
         </w:rPr>
-        <w:t xml:space="preserve">Multi-Outlet &amp; Multi-Investor: </w:t>
+        <w:t xml:space="preserve">5. Kas Kecil &amp; Persetujuan Berjenjang: </w:t>
       </w:r>
       <w:r>
         <w:rPr>
@@ -2150,8 +2236,166 @@
           <w:color w:val="374151"/>
           <w:sz w:val="18"/>
         </w:rPr>
-        <w:t>Pemisahan pembukuan cabang milik sendiri vs mitra waralaba secara transparan.</w:t>
+        <w:t>Belanja kebutuhan kecil outlet dibatasi nominalnya. Pembelian di luar gudang pusat dan transaksi di atas batas wajib disetujui Finance atau pimpinan sebelum diproses.</w:t>
       </w:r>
+    </w:p>
+    <w:p>
+      <w:pPr>
+        <w:pStyle w:val="ListBullet"/>
+        <w:spacing w:before="20" w:after="40" w:line="276" w:lineRule="auto"/>
+      </w:pPr>
+      <w:r>
+        <w:rPr>
+          <w:rFonts w:ascii="Segoe UI" w:hAnsi="Segoe UI"/>
+          <w:b/>
+          <w:color w:val="1F2937"/>
+          <w:sz w:val="18"/>
+        </w:rPr>
+        <w:t xml:space="preserve">6. Hutang ke Gudang Pusat: </w:t>
+      </w:r>
+      <w:r>
+        <w:rPr>
+          <w:rFonts w:ascii="Segoe UI" w:hAnsi="Segoe UI"/>
+          <w:color w:val="374151"/>
+          <w:sz w:val="18"/>
+        </w:rPr>
+        <w:t>Pantau tagihan tiap outlet beserta umur hutang (aging). Pembayaran dicatat fleksibel, per periode atau per nota.</w:t>
+      </w:r>
+    </w:p>
+    <w:p>
+      <w:pPr>
+        <w:pStyle w:val="ListBullet"/>
+        <w:spacing w:before="20" w:after="40" w:line="276" w:lineRule="auto"/>
+      </w:pPr>
+      <w:r>
+        <w:rPr>
+          <w:rFonts w:ascii="Segoe UI" w:hAnsi="Segoe UI"/>
+          <w:b/>
+          <w:color w:val="1F2937"/>
+          <w:sz w:val="18"/>
+        </w:rPr>
+        <w:t xml:space="preserve">7. Jurnal Otomatis &amp; Laporan Keuangan: </w:t>
+      </w:r>
+      <w:r>
+        <w:rPr>
+          <w:rFonts w:ascii="Segoe UI" w:hAnsi="Segoe UI"/>
+          <w:color w:val="374151"/>
+          <w:sz w:val="18"/>
+        </w:rPr>
+        <w:t>Penjualan harian outlet (Tunai &amp; QRIS) tercatat otomatis ke jurnal pendapatan dan buku kas pusat dengan minim rekonsiliasi manual. Tersedia laporan laba/rugi, arus kas, dan jurnal umum multi-cabang.</w:t>
+      </w:r>
+    </w:p>
+    <w:p>
+      <w:pPr>
+        <w:pStyle w:val="ListBullet"/>
+        <w:spacing w:before="20" w:after="40" w:line="276" w:lineRule="auto"/>
+      </w:pPr>
+      <w:r>
+        <w:rPr>
+          <w:rFonts w:ascii="Segoe UI" w:hAnsi="Segoe UI"/>
+          <w:b/>
+          <w:color w:val="1F2937"/>
+          <w:sz w:val="18"/>
+        </w:rPr>
+        <w:t xml:space="preserve">8. Hak Akses &amp; Fleksibilitas: </w:t>
+      </w:r>
+      <w:r>
+        <w:rPr>
+          <w:rFonts w:ascii="Segoe UI" w:hAnsi="Segoe UI"/>
+          <w:color w:val="374151"/>
+          <w:sz w:val="18"/>
+        </w:rPr>
+        <w:t>Hak akses diatur per peran dan per outlet. Fitur dapat dihidupkan atau dimatikan sesuai kebutuhan, dan outlet milik sendiri maupun mitra dikelola dalam satu sistem.</w:t>
+      </w:r>
+    </w:p>
+    <w:tbl>
+      <w:tblPr>
+        <w:tblW w:type="auto" w:w="0"/>
+        <w:jc w:val="center"/>
+        <w:tblLayout w:type="fixed"/>
+        <w:tblLook w:firstColumn="1" w:firstRow="1" w:lastColumn="0" w:lastRow="0" w:noHBand="0" w:noVBand="1" w:val="04A0"/>
+      </w:tblPr>
+      <w:tblGrid>
+        <w:gridCol w:w="9029"/>
+      </w:tblGrid>
+      <w:tr>
+        <w:tc>
+          <w:tcPr>
+            <w:tcW w:type="dxa" w:w="9029"/>
+            <w:shd w:fill="FFFBEB"/>
+            <w:tcMar>
+              <w:top w:w="120" w:type="dxa"/>
+              <w:bottom w:w="120" w:type="dxa"/>
+              <w:left w:w="160" w:type="dxa"/>
+              <w:right w:w="140" w:type="dxa"/>
+            </w:tcMar>
+            <w:tcBorders>
+              <w:top w:val="none"/>
+              <w:left w:val="single" w:sz="24" w:space="0" w:color="D97706"/>
+              <w:bottom w:val="none"/>
+              <w:right w:val="none"/>
+            </w:tcBorders>
+          </w:tcPr>
+          <w:p>
+            <w:pPr>
+              <w:spacing w:before="40" w:after="60" w:line="276" w:lineRule="auto"/>
+            </w:pPr>
+            <w:r>
+              <w:rPr>
+                <w:rFonts w:ascii="Segoe UI" w:hAnsi="Segoe UI"/>
+                <w:b/>
+                <w:color w:val="3E2723"/>
+                <w:sz w:val="20"/>
+              </w:rPr>
+              <w:t>Catatan Cakupan Modul:</w:t>
+            </w:r>
+          </w:p>
+          <w:p>
+            <w:pPr>
+              <w:spacing w:before="20" w:after="40" w:line="276" w:lineRule="auto"/>
+            </w:pPr>
+            <w:r>
+              <w:rPr>
+                <w:rFonts w:ascii="Segoe UI" w:hAnsi="Segoe UI"/>
+                <w:color w:val="374151"/>
+                <w:sz w:val="19"/>
+              </w:rPr>
+              <w:t>• Perpajakan (PPN/PPh): pengaturan tersedia di Fase 1, perhitungan lengkap pada tahap berikutnya.</w:t>
+            </w:r>
+          </w:p>
+          <w:p>
+            <w:pPr>
+              <w:spacing w:before="20" w:after="40" w:line="276" w:lineRule="auto"/>
+            </w:pPr>
+            <w:r>
+              <w:rPr>
+                <w:rFonts w:ascii="Segoe UI" w:hAnsi="Segoe UI"/>
+                <w:color w:val="374151"/>
+                <w:sz w:val="19"/>
+              </w:rPr>
+              <w:t>• Sistem gudang pusat tidak termasuk: Pembayaran ke pusat dicatat di ERP tanpa integrasi ke sistem gudang.</w:t>
+            </w:r>
+          </w:p>
+          <w:p>
+            <w:pPr>
+              <w:spacing w:before="20" w:after="40" w:line="276" w:lineRule="auto"/>
+            </w:pPr>
+            <w:r>
+              <w:rPr>
+                <w:rFonts w:ascii="Segoe UI" w:hAnsi="Segoe UI"/>
+                <w:color w:val="374151"/>
+                <w:sz w:val="19"/>
+              </w:rPr>
+              <w:t>• Skema bagi hasil mitra dibahas pada tahap berikutnya. Data kepemilikan outlet sudah disiapkan.</w:t>
+            </w:r>
+          </w:p>
+        </w:tc>
+      </w:tr>
+    </w:tbl>
+    <w:p>
+      <w:pPr>
+        <w:spacing w:after="80"/>
+      </w:pPr>
     </w:p>
     <w:p>
       <w:pPr>

</xml_diff>

<commit_message>
refactor: restructure ERP core features by user roles in proposal documentation and generator script
</commit_message>
<xml_diff>
--- a/Rekomendasi_Solusi_Teknologi_Kopi_Seduhan_Jodi.docx
+++ b/Rekomendasi_Solusi_Teknologi_Kopi_Seduhan_Jodi.docx
@@ -2058,7 +2058,7 @@
           <w:color w:val="4A2E18"/>
           <w:sz w:val="23"/>
         </w:rPr>
-        <w:t>Fitur Kunci ERP Backoffice &amp; Finance (Fase 1 Core):</w:t>
+        <w:t>Fitur Kunci ERP Backoffice &amp; Finance (Fase 1 Core) per Peran:</w:t>
       </w:r>
     </w:p>
     <w:tbl>
@@ -2126,6 +2126,21 @@
     </w:p>
     <w:p>
       <w:pPr>
+        <w:keepNext/>
+        <w:spacing w:before="160" w:after="40"/>
+      </w:pPr>
+      <w:r>
+        <w:rPr>
+          <w:rFonts w:ascii="Segoe UI" w:hAnsi="Segoe UI"/>
+          <w:b/>
+          <w:color w:val="C27835"/>
+          <w:sz w:val="20"/>
+        </w:rPr>
+        <w:t>A. OWNER / PIMPINAN (Memantau dan Memutuskan)</w:t>
+      </w:r>
+    </w:p>
+    <w:p>
+      <w:pPr>
         <w:pStyle w:val="ListBullet"/>
         <w:spacing w:before="20" w:after="40" w:line="276" w:lineRule="auto"/>
       </w:pPr>
@@ -2136,7 +2151,7 @@
           <w:color w:val="1F2937"/>
           <w:sz w:val="18"/>
         </w:rPr>
-        <w:t xml:space="preserve">1. Stok Terpisah per Outlet, Terpantau Terpusat: </w:t>
+        <w:t xml:space="preserve">1. Pantau Semua Outlet Secara Live: </w:t>
       </w:r>
       <w:r>
         <w:rPr>
@@ -2144,7 +2159,374 @@
           <w:color w:val="374151"/>
           <w:sz w:val="18"/>
         </w:rPr>
-        <w:t>Stok tiap outlet tercatat di satu sistem. Bertambah saat barang diterima di outlet dan berkurang otomatis sesuai resep setiap minuman terjual. Pusat memantau semua outlet secara live dengan peringatan stok menipis, sedangkan tiap outlet hanya melihat stoknya sendiri.</w:t>
+        <w:t>Lihat stok dan penjualan seluruh outlet dalam satu layar, lengkap dengan peringatan stok menipis.</w:t>
+      </w:r>
+    </w:p>
+    <w:p>
+      <w:pPr>
+        <w:pStyle w:val="ListBullet"/>
+        <w:spacing w:before="20" w:after="40" w:line="276" w:lineRule="auto"/>
+      </w:pPr>
+      <w:r>
+        <w:rPr>
+          <w:rFonts w:ascii="Segoe UI" w:hAnsi="Segoe UI"/>
+          <w:b/>
+          <w:color w:val="1F2937"/>
+          <w:sz w:val="18"/>
+        </w:rPr>
+        <w:t xml:space="preserve">2. Persetujuan Pembelian &amp; Transaksi Besar: </w:t>
+      </w:r>
+      <w:r>
+        <w:rPr>
+          <w:rFonts w:ascii="Segoe UI" w:hAnsi="Segoe UI"/>
+          <w:color w:val="374151"/>
+          <w:sz w:val="18"/>
+        </w:rPr>
+        <w:t>Setujui pembelian di luar gudang pusat dan transaksi di atas batas nominal sebelum diproses.</w:t>
+      </w:r>
+    </w:p>
+    <w:p>
+      <w:pPr>
+        <w:pStyle w:val="ListBullet"/>
+        <w:spacing w:before="20" w:after="40" w:line="276" w:lineRule="auto"/>
+      </w:pPr>
+      <w:r>
+        <w:rPr>
+          <w:rFonts w:ascii="Segoe UI" w:hAnsi="Segoe UI"/>
+          <w:b/>
+          <w:color w:val="1F2937"/>
+          <w:sz w:val="18"/>
+        </w:rPr>
+        <w:t xml:space="preserve">3. Margin &amp; Kinerja Outlet: </w:t>
+      </w:r>
+      <w:r>
+        <w:rPr>
+          <w:rFonts w:ascii="Segoe UI" w:hAnsi="Segoe UI"/>
+          <w:color w:val="374151"/>
+          <w:sz w:val="18"/>
+        </w:rPr>
+        <w:t>Bandingkan margin dan laba/rugi tiap outlet dengan HPP yang sudah terkoreksi, sehingga angkanya akurat.</w:t>
+      </w:r>
+    </w:p>
+    <w:p>
+      <w:pPr>
+        <w:pStyle w:val="ListBullet"/>
+        <w:spacing w:before="20" w:after="40" w:line="276" w:lineRule="auto"/>
+      </w:pPr>
+      <w:r>
+        <w:rPr>
+          <w:rFonts w:ascii="Segoe UI" w:hAnsi="Segoe UI"/>
+          <w:b/>
+          <w:color w:val="1F2937"/>
+          <w:sz w:val="18"/>
+        </w:rPr>
+        <w:t xml:space="preserve">4. Outlet Sendiri &amp; Mitra dalam Satu Sistem: </w:t>
+      </w:r>
+      <w:r>
+        <w:rPr>
+          <w:rFonts w:ascii="Segoe UI" w:hAnsi="Segoe UI"/>
+          <w:color w:val="374151"/>
+          <w:sz w:val="18"/>
+        </w:rPr>
+        <w:t>Kelola outlet milik sendiri maupun mitra dalam satu sistem, dengan data kepemilikan yang sudah disiapkan.</w:t>
+      </w:r>
+    </w:p>
+    <w:p>
+      <w:pPr>
+        <w:keepNext/>
+        <w:spacing w:before="160" w:after="40"/>
+      </w:pPr>
+      <w:r>
+        <w:rPr>
+          <w:rFonts w:ascii="Segoe UI" w:hAnsi="Segoe UI"/>
+          <w:b/>
+          <w:color w:val="C27835"/>
+          <w:sz w:val="20"/>
+        </w:rPr>
+        <w:t>B. ADMIN PUSAT (Mengatur Data Induk dan Aturan Sistem)</w:t>
+      </w:r>
+    </w:p>
+    <w:p>
+      <w:pPr>
+        <w:pStyle w:val="ListBullet"/>
+        <w:spacing w:before="20" w:after="40" w:line="276" w:lineRule="auto"/>
+      </w:pPr>
+      <w:r>
+        <w:rPr>
+          <w:rFonts w:ascii="Segoe UI" w:hAnsi="Segoe UI"/>
+          <w:b/>
+          <w:color w:val="1F2937"/>
+          <w:sz w:val="18"/>
+        </w:rPr>
+        <w:t xml:space="preserve">1. Daftar Bahan, Resep &amp; Menu: </w:t>
+      </w:r>
+      <w:r>
+        <w:rPr>
+          <w:rFonts w:ascii="Segoe UI" w:hAnsi="Segoe UI"/>
+          <w:color w:val="374151"/>
+          <w:sz w:val="18"/>
+        </w:rPr>
+        <w:t>Kelola daftar induk bahan baku dan kemasan, resep racikan (BOM) yang menghitung modal per gelas, serta bahan olahan seperti sirup dan cold brew.</w:t>
+      </w:r>
+    </w:p>
+    <w:p>
+      <w:pPr>
+        <w:pStyle w:val="ListBullet"/>
+        <w:spacing w:before="20" w:after="40" w:line="276" w:lineRule="auto"/>
+      </w:pPr>
+      <w:r>
+        <w:rPr>
+          <w:rFonts w:ascii="Segoe UI" w:hAnsi="Segoe UI"/>
+          <w:b/>
+          <w:color w:val="1F2937"/>
+          <w:sz w:val="18"/>
+        </w:rPr>
+        <w:t xml:space="preserve">2. Persetujuan Menu Khusus Outlet: </w:t>
+      </w:r>
+      <w:r>
+        <w:rPr>
+          <w:rFonts w:ascii="Segoe UI" w:hAnsi="Segoe UI"/>
+          <w:color w:val="374151"/>
+          <w:sz w:val="18"/>
+        </w:rPr>
+        <w:t>Tinjau menu dan resep yang diusulkan outlet, lalu setujui sebelum tampil di outlet tersebut.</w:t>
+      </w:r>
+    </w:p>
+    <w:p>
+      <w:pPr>
+        <w:pStyle w:val="ListBullet"/>
+        <w:spacing w:before="20" w:after="40" w:line="276" w:lineRule="auto"/>
+      </w:pPr>
+      <w:r>
+        <w:rPr>
+          <w:rFonts w:ascii="Segoe UI" w:hAnsi="Segoe UI"/>
+          <w:b/>
+          <w:color w:val="1F2937"/>
+          <w:sz w:val="18"/>
+        </w:rPr>
+        <w:t xml:space="preserve">3. Hak Akses per Peran &amp; Outlet: </w:t>
+      </w:r>
+      <w:r>
+        <w:rPr>
+          <w:rFonts w:ascii="Segoe UI" w:hAnsi="Segoe UI"/>
+          <w:color w:val="374151"/>
+          <w:sz w:val="18"/>
+        </w:rPr>
+        <w:t>Atur siapa boleh melihat dan mengerjakan apa, per peran dan per outlet.</w:t>
+      </w:r>
+    </w:p>
+    <w:p>
+      <w:pPr>
+        <w:pStyle w:val="ListBullet"/>
+        <w:spacing w:before="20" w:after="40" w:line="276" w:lineRule="auto"/>
+      </w:pPr>
+      <w:r>
+        <w:rPr>
+          <w:rFonts w:ascii="Segoe UI" w:hAnsi="Segoe UI"/>
+          <w:b/>
+          <w:color w:val="1F2937"/>
+          <w:sz w:val="18"/>
+        </w:rPr>
+        <w:t xml:space="preserve">4. Fitur Hidup/Mati: </w:t>
+      </w:r>
+      <w:r>
+        <w:rPr>
+          <w:rFonts w:ascii="Segoe UI" w:hAnsi="Segoe UI"/>
+          <w:color w:val="374151"/>
+          <w:sz w:val="18"/>
+        </w:rPr>
+        <w:t>Aktifkan atau matikan fitur sesuai kebutuhan bisnis tanpa mengubah sistem.</w:t>
+      </w:r>
+    </w:p>
+    <w:p>
+      <w:pPr>
+        <w:keepNext/>
+        <w:spacing w:before="160" w:after="40"/>
+      </w:pPr>
+      <w:r>
+        <w:rPr>
+          <w:rFonts w:ascii="Segoe UI" w:hAnsi="Segoe UI"/>
+          <w:b/>
+          <w:color w:val="C27835"/>
+          <w:sz w:val="20"/>
+        </w:rPr>
+        <w:t>C. FINANCE (Memastikan Angka Akurat dan Terkendali)</w:t>
+      </w:r>
+    </w:p>
+    <w:p>
+      <w:pPr>
+        <w:pStyle w:val="ListBullet"/>
+        <w:spacing w:before="20" w:after="40" w:line="276" w:lineRule="auto"/>
+      </w:pPr>
+      <w:r>
+        <w:rPr>
+          <w:rFonts w:ascii="Segoe UI" w:hAnsi="Segoe UI"/>
+          <w:b/>
+          <w:color w:val="1F2937"/>
+          <w:sz w:val="18"/>
+        </w:rPr>
+        <w:t xml:space="preserve">1. Input Nota &amp; Koreksi HPP Otomatis (True-Up HPP): </w:t>
+      </w:r>
+      <w:r>
+        <w:rPr>
+          <w:rFonts w:ascii="Segoe UI" w:hAnsi="Segoe UI"/>
+          <w:color w:val="374151"/>
+          <w:sz w:val="18"/>
+        </w:rPr>
+        <w:t>Modal sementara memakai harga terakhir, lalu dikoreksi otomatis begitu nota supplier diinput.</w:t>
+      </w:r>
+    </w:p>
+    <w:p>
+      <w:pPr>
+        <w:pStyle w:val="ListBullet"/>
+        <w:spacing w:before="20" w:after="40" w:line="276" w:lineRule="auto"/>
+      </w:pPr>
+      <w:r>
+        <w:rPr>
+          <w:rFonts w:ascii="Segoe UI" w:hAnsi="Segoe UI"/>
+          <w:b/>
+          <w:color w:val="1F2937"/>
+          <w:sz w:val="18"/>
+        </w:rPr>
+        <w:t xml:space="preserve">2. Hutang ke Gudang Pusat: </w:t>
+      </w:r>
+      <w:r>
+        <w:rPr>
+          <w:rFonts w:ascii="Segoe UI" w:hAnsi="Segoe UI"/>
+          <w:color w:val="374151"/>
+          <w:sz w:val="18"/>
+        </w:rPr>
+        <w:t>Pantau tagihan tiap outlet beserta umur hutang (aging).</w:t>
+      </w:r>
+    </w:p>
+    <w:p>
+      <w:pPr>
+        <w:pStyle w:val="ListBullet"/>
+        <w:spacing w:before="20" w:after="40" w:line="276" w:lineRule="auto"/>
+      </w:pPr>
+      <w:r>
+        <w:rPr>
+          <w:rFonts w:ascii="Segoe UI" w:hAnsi="Segoe UI"/>
+          <w:b/>
+          <w:color w:val="1F2937"/>
+          <w:sz w:val="18"/>
+        </w:rPr>
+        <w:t xml:space="preserve">3. Catat Pembayaran ke Pusat: </w:t>
+      </w:r>
+      <w:r>
+        <w:rPr>
+          <w:rFonts w:ascii="Segoe UI" w:hAnsi="Segoe UI"/>
+          <w:color w:val="374151"/>
+          <w:sz w:val="18"/>
+        </w:rPr>
+        <w:t>Catat pembayaran secara fleksibel, per periode atau per nota.</w:t>
+      </w:r>
+    </w:p>
+    <w:p>
+      <w:pPr>
+        <w:pStyle w:val="ListBullet"/>
+        <w:spacing w:before="20" w:after="40" w:line="276" w:lineRule="auto"/>
+      </w:pPr>
+      <w:r>
+        <w:rPr>
+          <w:rFonts w:ascii="Segoe UI" w:hAnsi="Segoe UI"/>
+          <w:b/>
+          <w:color w:val="1F2937"/>
+          <w:sz w:val="18"/>
+        </w:rPr>
+        <w:t xml:space="preserve">4. Kas Kecil &amp; Persetujuan Berjenjang: </w:t>
+      </w:r>
+      <w:r>
+        <w:rPr>
+          <w:rFonts w:ascii="Segoe UI" w:hAnsi="Segoe UI"/>
+          <w:color w:val="374151"/>
+          <w:sz w:val="18"/>
+        </w:rPr>
+        <w:t>Setujui belanja kebutuhan kecil outlet yang melewati batas nominal sebelum dana dicairkan.</w:t>
+      </w:r>
+    </w:p>
+    <w:p>
+      <w:pPr>
+        <w:pStyle w:val="ListBullet"/>
+        <w:spacing w:before="20" w:after="40" w:line="276" w:lineRule="auto"/>
+      </w:pPr>
+      <w:r>
+        <w:rPr>
+          <w:rFonts w:ascii="Segoe UI" w:hAnsi="Segoe UI"/>
+          <w:b/>
+          <w:color w:val="1F2937"/>
+          <w:sz w:val="18"/>
+        </w:rPr>
+        <w:t xml:space="preserve">5. Jurnal Otomatis: </w:t>
+      </w:r>
+      <w:r>
+        <w:rPr>
+          <w:rFonts w:ascii="Segoe UI" w:hAnsi="Segoe UI"/>
+          <w:color w:val="374151"/>
+          <w:sz w:val="18"/>
+        </w:rPr>
+        <w:t>Penjualan harian outlet (Tunai &amp; QRIS) tercatat otomatis ke jurnal pendapatan dan buku kas pusat, dengan minim rekonsiliasi manual.</w:t>
+      </w:r>
+    </w:p>
+    <w:p>
+      <w:pPr>
+        <w:pStyle w:val="ListBullet"/>
+        <w:spacing w:before="20" w:after="40" w:line="276" w:lineRule="auto"/>
+      </w:pPr>
+      <w:r>
+        <w:rPr>
+          <w:rFonts w:ascii="Segoe UI" w:hAnsi="Segoe UI"/>
+          <w:b/>
+          <w:color w:val="1F2937"/>
+          <w:sz w:val="18"/>
+        </w:rPr>
+        <w:t xml:space="preserve">6. Laporan Keuangan Lengkap: </w:t>
+      </w:r>
+      <w:r>
+        <w:rPr>
+          <w:rFonts w:ascii="Segoe UI" w:hAnsi="Segoe UI"/>
+          <w:color w:val="374151"/>
+          <w:sz w:val="18"/>
+        </w:rPr>
+        <w:t>Laporan laba/rugi, arus kas, dan jurnal umum multi-cabang.</w:t>
+      </w:r>
+    </w:p>
+    <w:p>
+      <w:pPr>
+        <w:keepNext/>
+        <w:spacing w:before="160" w:after="40"/>
+      </w:pPr>
+      <w:r>
+        <w:rPr>
+          <w:rFonts w:ascii="Segoe UI" w:hAnsi="Segoe UI"/>
+          <w:b/>
+          <w:color w:val="C27835"/>
+          <w:sz w:val="20"/>
+        </w:rPr>
+        <w:t>D. STORE MANAGER (Mengelola Operasional Outlet Sendiri - Akses Terbatas)</w:t>
+      </w:r>
+    </w:p>
+    <w:p>
+      <w:pPr>
+        <w:pStyle w:val="ListBullet"/>
+        <w:spacing w:before="20" w:after="40" w:line="276" w:lineRule="auto"/>
+      </w:pPr>
+      <w:r>
+        <w:rPr>
+          <w:rFonts w:ascii="Segoe UI" w:hAnsi="Segoe UI"/>
+          <w:b/>
+          <w:color w:val="1F2937"/>
+          <w:sz w:val="18"/>
+        </w:rPr>
+        <w:t xml:space="preserve">1. Stok Outlet Sendiri: </w:t>
+      </w:r>
+      <w:r>
+        <w:rPr>
+          <w:rFonts w:ascii="Segoe UI" w:hAnsi="Segoe UI"/>
+          <w:color w:val="374151"/>
+          <w:sz w:val="18"/>
+        </w:rPr>
+        <w:t>Lihat stok outlet dan terima peringatan saat stok menipis.</w:t>
       </w:r>
     </w:p>
     <w:p>
@@ -2167,7 +2549,7 @@
           <w:color w:val="374151"/>
           <w:sz w:val="18"/>
         </w:rPr>
-        <w:t>Outlet memesan ke gudang pusat cukup dengan jenis dan jumlah barang. Saat barang diterima, stok langsung bertambah dengan status “menunggu nota”.</w:t>
+        <w:t>Pesan ke gudang pusat cukup dengan jenis dan jumlah barang.</w:t>
       </w:r>
     </w:p>
     <w:p>
@@ -2182,7 +2564,7 @@
           <w:color w:val="1F2937"/>
           <w:sz w:val="18"/>
         </w:rPr>
-        <w:t xml:space="preserve">3. Koreksi HPP Otomatis (True-Up HPP): </w:t>
+        <w:t xml:space="preserve">3. Penerimaan Barang: </w:t>
       </w:r>
       <w:r>
         <w:rPr>
@@ -2190,7 +2572,7 @@
           <w:color w:val="374151"/>
           <w:sz w:val="18"/>
         </w:rPr>
-        <w:t>Modal sementara memakai harga terakhir, lalu dikoreksi otomatis saat nota supplier diinput, sehingga laporan margin selalu akurat.</w:t>
+        <w:t>Saat barang diterima, stok langsung bertambah dengan status “menunggu nota”.</w:t>
       </w:r>
     </w:p>
     <w:p>
@@ -2205,7 +2587,7 @@
           <w:color w:val="1F2937"/>
           <w:sz w:val="18"/>
         </w:rPr>
-        <w:t xml:space="preserve">4. Resep, Bahan &amp; Menu: </w:t>
+        <w:t xml:space="preserve">4. Belanja Kebutuhan Kecil: </w:t>
       </w:r>
       <w:r>
         <w:rPr>
@@ -2213,7 +2595,7 @@
           <w:color w:val="374151"/>
           <w:sz w:val="18"/>
         </w:rPr>
-        <w:t>Master 25+ bahan baku dan kemasan, resep racikan (BOM) yang menghitung modal per gelas, bahan olahan seperti sirup dan cold brew, serta menu khusus outlet yang disetujui pusat.</w:t>
+        <w:t>Catat belanja harian outlet dalam batas nominal yang berlaku, dan ajukan persetujuan bila melewati batas.</w:t>
       </w:r>
     </w:p>
     <w:p>
@@ -2228,7 +2610,7 @@
           <w:color w:val="1F2937"/>
           <w:sz w:val="18"/>
         </w:rPr>
-        <w:t xml:space="preserve">5. Kas Kecil &amp; Persetujuan Berjenjang: </w:t>
+        <w:t xml:space="preserve">5. Usulan Menu Khusus Outlet: </w:t>
       </w:r>
       <w:r>
         <w:rPr>
@@ -2236,7 +2618,7 @@
           <w:color w:val="374151"/>
           <w:sz w:val="18"/>
         </w:rPr>
-        <w:t>Belanja kebutuhan kecil outlet dibatasi nominalnya. Pembelian di luar gudang pusat dan transaksi di atas batas wajib disetujui Finance atau pimpinan sebelum diproses.</w:t>
+        <w:t>Usulkan menu dan resep khusus outlet untuk disetujui pusat.</w:t>
       </w:r>
     </w:p>
     <w:p>
@@ -2251,7 +2633,7 @@
           <w:color w:val="1F2937"/>
           <w:sz w:val="18"/>
         </w:rPr>
-        <w:t xml:space="preserve">6. Hutang ke Gudang Pusat: </w:t>
+        <w:t xml:space="preserve">6. Pengajuan Pembelian di Luar Gudang Pusat: </w:t>
       </w:r>
       <w:r>
         <w:rPr>
@@ -2259,143 +2641,8 @@
           <w:color w:val="374151"/>
           <w:sz w:val="18"/>
         </w:rPr>
-        <w:t>Pantau tagihan tiap outlet beserta umur hutang (aging). Pembayaran dicatat fleksibel, per periode atau per nota.</w:t>
+        <w:t>Ajukan pembelian ke toko lain dengan alasan, untuk disetujui pimpinan.</w:t>
       </w:r>
-    </w:p>
-    <w:p>
-      <w:pPr>
-        <w:pStyle w:val="ListBullet"/>
-        <w:spacing w:before="20" w:after="40" w:line="276" w:lineRule="auto"/>
-      </w:pPr>
-      <w:r>
-        <w:rPr>
-          <w:rFonts w:ascii="Segoe UI" w:hAnsi="Segoe UI"/>
-          <w:b/>
-          <w:color w:val="1F2937"/>
-          <w:sz w:val="18"/>
-        </w:rPr>
-        <w:t xml:space="preserve">7. Jurnal Otomatis &amp; Laporan Keuangan: </w:t>
-      </w:r>
-      <w:r>
-        <w:rPr>
-          <w:rFonts w:ascii="Segoe UI" w:hAnsi="Segoe UI"/>
-          <w:color w:val="374151"/>
-          <w:sz w:val="18"/>
-        </w:rPr>
-        <w:t>Penjualan harian outlet (Tunai &amp; QRIS) tercatat otomatis ke jurnal pendapatan dan buku kas pusat dengan minim rekonsiliasi manual. Tersedia laporan laba/rugi, arus kas, dan jurnal umum multi-cabang.</w:t>
-      </w:r>
-    </w:p>
-    <w:p>
-      <w:pPr>
-        <w:pStyle w:val="ListBullet"/>
-        <w:spacing w:before="20" w:after="40" w:line="276" w:lineRule="auto"/>
-      </w:pPr>
-      <w:r>
-        <w:rPr>
-          <w:rFonts w:ascii="Segoe UI" w:hAnsi="Segoe UI"/>
-          <w:b/>
-          <w:color w:val="1F2937"/>
-          <w:sz w:val="18"/>
-        </w:rPr>
-        <w:t xml:space="preserve">8. Hak Akses &amp; Fleksibilitas: </w:t>
-      </w:r>
-      <w:r>
-        <w:rPr>
-          <w:rFonts w:ascii="Segoe UI" w:hAnsi="Segoe UI"/>
-          <w:color w:val="374151"/>
-          <w:sz w:val="18"/>
-        </w:rPr>
-        <w:t>Hak akses diatur per peran dan per outlet. Fitur dapat dihidupkan atau dimatikan sesuai kebutuhan, dan outlet milik sendiri maupun mitra dikelola dalam satu sistem.</w:t>
-      </w:r>
-    </w:p>
-    <w:tbl>
-      <w:tblPr>
-        <w:tblW w:type="auto" w:w="0"/>
-        <w:jc w:val="center"/>
-        <w:tblLayout w:type="fixed"/>
-        <w:tblLook w:firstColumn="1" w:firstRow="1" w:lastColumn="0" w:lastRow="0" w:noHBand="0" w:noVBand="1" w:val="04A0"/>
-      </w:tblPr>
-      <w:tblGrid>
-        <w:gridCol w:w="9029"/>
-      </w:tblGrid>
-      <w:tr>
-        <w:tc>
-          <w:tcPr>
-            <w:tcW w:type="dxa" w:w="9029"/>
-            <w:shd w:fill="FFFBEB"/>
-            <w:tcMar>
-              <w:top w:w="120" w:type="dxa"/>
-              <w:bottom w:w="120" w:type="dxa"/>
-              <w:left w:w="160" w:type="dxa"/>
-              <w:right w:w="140" w:type="dxa"/>
-            </w:tcMar>
-            <w:tcBorders>
-              <w:top w:val="none"/>
-              <w:left w:val="single" w:sz="24" w:space="0" w:color="D97706"/>
-              <w:bottom w:val="none"/>
-              <w:right w:val="none"/>
-            </w:tcBorders>
-          </w:tcPr>
-          <w:p>
-            <w:pPr>
-              <w:spacing w:before="40" w:after="60" w:line="276" w:lineRule="auto"/>
-            </w:pPr>
-            <w:r>
-              <w:rPr>
-                <w:rFonts w:ascii="Segoe UI" w:hAnsi="Segoe UI"/>
-                <w:b/>
-                <w:color w:val="3E2723"/>
-                <w:sz w:val="20"/>
-              </w:rPr>
-              <w:t>Catatan Cakupan Modul:</w:t>
-            </w:r>
-          </w:p>
-          <w:p>
-            <w:pPr>
-              <w:spacing w:before="20" w:after="40" w:line="276" w:lineRule="auto"/>
-            </w:pPr>
-            <w:r>
-              <w:rPr>
-                <w:rFonts w:ascii="Segoe UI" w:hAnsi="Segoe UI"/>
-                <w:color w:val="374151"/>
-                <w:sz w:val="19"/>
-              </w:rPr>
-              <w:t>• Perpajakan (PPN/PPh): pengaturan tersedia di Fase 1, perhitungan lengkap pada tahap berikutnya.</w:t>
-            </w:r>
-          </w:p>
-          <w:p>
-            <w:pPr>
-              <w:spacing w:before="20" w:after="40" w:line="276" w:lineRule="auto"/>
-            </w:pPr>
-            <w:r>
-              <w:rPr>
-                <w:rFonts w:ascii="Segoe UI" w:hAnsi="Segoe UI"/>
-                <w:color w:val="374151"/>
-                <w:sz w:val="19"/>
-              </w:rPr>
-              <w:t>• Sistem gudang pusat tidak termasuk: Pembayaran ke pusat dicatat di ERP tanpa integrasi ke sistem gudang.</w:t>
-            </w:r>
-          </w:p>
-          <w:p>
-            <w:pPr>
-              <w:spacing w:before="20" w:after="40" w:line="276" w:lineRule="auto"/>
-            </w:pPr>
-            <w:r>
-              <w:rPr>
-                <w:rFonts w:ascii="Segoe UI" w:hAnsi="Segoe UI"/>
-                <w:color w:val="374151"/>
-                <w:sz w:val="19"/>
-              </w:rPr>
-              <w:t>• Skema bagi hasil mitra dibahas pada tahap berikutnya. Data kepemilikan outlet sudah disiapkan.</w:t>
-            </w:r>
-          </w:p>
-        </w:tc>
-      </w:tr>
-    </w:tbl>
-    <w:p>
-      <w:pPr>
-        <w:spacing w:after="80"/>
-      </w:pPr>
     </w:p>
     <w:p>
       <w:pPr>

</xml_diff>

<commit_message>
feat: add comprehensive proposal documentation, markdown drafts, and interactive proposal app component
</commit_message>
<xml_diff>
--- a/Rekomendasi_Solusi_Teknologi_Kopi_Seduhan_Jodi.docx
+++ b/Rekomendasi_Solusi_Teknologi_Kopi_Seduhan_Jodi.docx
@@ -2642,6 +2642,344 @@
           <w:sz w:val="18"/>
         </w:rPr>
         <w:t>Ajukan pembelian ke toko lain dengan alasan, untuk disetujui pimpinan.</w:t>
+      </w:r>
+    </w:p>
+    <w:p>
+      <w:pPr>
+        <w:keepNext/>
+        <w:spacing w:before="200" w:after="60"/>
+      </w:pPr>
+      <w:r>
+        <w:rPr>
+          <w:rFonts w:ascii="Segoe UI" w:hAnsi="Segoe UI"/>
+          <w:b/>
+          <w:color w:val="4A2E18"/>
+          <w:sz w:val="23"/>
+        </w:rPr>
+        <w:t>Fitur Kunci POS Kasir Outlet (Fase 1 Core) per Peran:</w:t>
+      </w:r>
+    </w:p>
+    <w:tbl>
+      <w:tblPr>
+        <w:tblW w:type="auto" w:w="0"/>
+        <w:jc w:val="center"/>
+        <w:tblLayout w:type="fixed"/>
+        <w:tblLook w:firstColumn="1" w:firstRow="1" w:lastColumn="0" w:lastRow="0" w:noHBand="0" w:noVBand="1" w:val="04A0"/>
+      </w:tblPr>
+      <w:tblGrid>
+        <w:gridCol w:w="9029"/>
+      </w:tblGrid>
+      <w:tr>
+        <w:tc>
+          <w:tcPr>
+            <w:tcW w:type="dxa" w:w="9029"/>
+            <w:shd w:fill="FFFBEB"/>
+            <w:tcMar>
+              <w:top w:w="120" w:type="dxa"/>
+              <w:bottom w:w="120" w:type="dxa"/>
+              <w:left w:w="160" w:type="dxa"/>
+              <w:right w:w="140" w:type="dxa"/>
+            </w:tcMar>
+            <w:tcBorders>
+              <w:top w:val="none"/>
+              <w:left w:val="single" w:sz="24" w:space="0" w:color="D97706"/>
+              <w:bottom w:val="none"/>
+              <w:right w:val="none"/>
+            </w:tcBorders>
+          </w:tcPr>
+          <w:p>
+            <w:pPr>
+              <w:spacing w:before="40" w:after="60" w:line="276" w:lineRule="auto"/>
+            </w:pPr>
+            <w:r>
+              <w:rPr>
+                <w:rFonts w:ascii="Segoe UI" w:hAnsi="Segoe UI"/>
+                <w:b/>
+                <w:color w:val="3E2723"/>
+                <w:sz w:val="20"/>
+              </w:rPr>
+              <w:t>Alur Utama POS Kasir:</w:t>
+            </w:r>
+          </w:p>
+          <w:p>
+            <w:pPr>
+              <w:spacing w:before="20" w:after="40" w:line="276" w:lineRule="auto"/>
+            </w:pPr>
+            <w:r>
+              <w:rPr>
+                <w:rFonts w:ascii="Segoe UI" w:hAnsi="Segoe UI"/>
+                <w:color w:val="374151"/>
+                <w:sz w:val="19"/>
+              </w:rPr>
+              <w:t>Pilih Menu → Bayar → Struk &amp; Tiket KDS → Stok Berkurang → Omzet Masuk ERP</w:t>
+            </w:r>
+          </w:p>
+        </w:tc>
+      </w:tr>
+    </w:tbl>
+    <w:p>
+      <w:pPr>
+        <w:spacing w:after="80"/>
+      </w:pPr>
+    </w:p>
+    <w:p>
+      <w:pPr>
+        <w:keepNext/>
+        <w:spacing w:before="160" w:after="40"/>
+      </w:pPr>
+      <w:r>
+        <w:rPr>
+          <w:rFonts w:ascii="Segoe UI" w:hAnsi="Segoe UI"/>
+          <w:b/>
+          <w:color w:val="C27835"/>
+          <w:sz w:val="20"/>
+        </w:rPr>
+        <w:t>A. KASIR (Melayani Pelanggan dengan Cepat)</w:t>
+      </w:r>
+    </w:p>
+    <w:p>
+      <w:pPr>
+        <w:pStyle w:val="ListBullet"/>
+        <w:spacing w:before="20" w:after="40" w:line="276" w:lineRule="auto"/>
+      </w:pPr>
+      <w:r>
+        <w:rPr>
+          <w:rFonts w:ascii="Segoe UI" w:hAnsi="Segoe UI"/>
+          <w:b/>
+          <w:color w:val="1F2937"/>
+          <w:sz w:val="18"/>
+        </w:rPr>
+        <w:t xml:space="preserve">1. Transaksi Cepat dengan Varian: </w:t>
+      </w:r>
+      <w:r>
+        <w:rPr>
+          <w:rFonts w:ascii="Segoe UI" w:hAnsi="Segoe UI"/>
+          <w:color w:val="374151"/>
+          <w:sz w:val="18"/>
+        </w:rPr>
+        <w:t>Menu tampil sesuai outlet. Atur varian per minuman: ukuran cup, takaran gula, opsi susu alternatif seperti oatmilk, plus catatan khusus.</w:t>
+      </w:r>
+    </w:p>
+    <w:p>
+      <w:pPr>
+        <w:pStyle w:val="ListBullet"/>
+        <w:spacing w:before="20" w:after="40" w:line="276" w:lineRule="auto"/>
+      </w:pPr>
+      <w:r>
+        <w:rPr>
+          <w:rFonts w:ascii="Segoe UI" w:hAnsi="Segoe UI"/>
+          <w:b/>
+          <w:color w:val="1F2937"/>
+          <w:sz w:val="18"/>
+        </w:rPr>
+        <w:t xml:space="preserve">2. Pembayaran Tunai &amp; QRIS: </w:t>
+      </w:r>
+      <w:r>
+        <w:rPr>
+          <w:rFonts w:ascii="Segoe UI" w:hAnsi="Segoe UI"/>
+          <w:color w:val="374151"/>
+          <w:sz w:val="18"/>
+        </w:rPr>
+        <w:t>Tunai dengan hitungan kembalian otomatis, atau QRIS dinamis Midtrans.</w:t>
+      </w:r>
+    </w:p>
+    <w:p>
+      <w:pPr>
+        <w:pStyle w:val="ListBullet"/>
+        <w:spacing w:before="20" w:after="40" w:line="276" w:lineRule="auto"/>
+      </w:pPr>
+      <w:r>
+        <w:rPr>
+          <w:rFonts w:ascii="Segoe UI" w:hAnsi="Segoe UI"/>
+          <w:b/>
+          <w:color w:val="1F2937"/>
+          <w:sz w:val="18"/>
+        </w:rPr>
+        <w:t xml:space="preserve">3. Voucher &amp; Promo: </w:t>
+      </w:r>
+      <w:r>
+        <w:rPr>
+          <w:rFonts w:ascii="Segoe UI" w:hAnsi="Segoe UI"/>
+          <w:color w:val="374151"/>
+          <w:sz w:val="18"/>
+        </w:rPr>
+        <w:t>Voucher global maupun khusus outlet langsung diterapkan di keranjang.</w:t>
+      </w:r>
+    </w:p>
+    <w:p>
+      <w:pPr>
+        <w:pStyle w:val="ListBullet"/>
+        <w:spacing w:before="20" w:after="40" w:line="276" w:lineRule="auto"/>
+      </w:pPr>
+      <w:r>
+        <w:rPr>
+          <w:rFonts w:ascii="Segoe UI" w:hAnsi="Segoe UI"/>
+          <w:b/>
+          <w:color w:val="1F2937"/>
+          <w:sz w:val="18"/>
+        </w:rPr>
+        <w:t xml:space="preserve">4. Menu Habis Otomatis: </w:t>
+      </w:r>
+      <w:r>
+        <w:rPr>
+          <w:rFonts w:ascii="Segoe UI" w:hAnsi="Segoe UI"/>
+          <w:color w:val="374151"/>
+          <w:sz w:val="18"/>
+        </w:rPr>
+        <w:t>Stok berkurang sesuai resep setiap minuman terjual. Menu otomatis ditandai habis bila bahannya tidak cukup.</w:t>
+      </w:r>
+    </w:p>
+    <w:p>
+      <w:pPr>
+        <w:pStyle w:val="ListBullet"/>
+        <w:spacing w:before="20" w:after="40" w:line="276" w:lineRule="auto"/>
+      </w:pPr>
+      <w:r>
+        <w:rPr>
+          <w:rFonts w:ascii="Segoe UI" w:hAnsi="Segoe UI"/>
+          <w:b/>
+          <w:color w:val="1F2937"/>
+          <w:sz w:val="18"/>
+        </w:rPr>
+        <w:t xml:space="preserve">5. Struk &amp; Tiket ke Dapur: </w:t>
+      </w:r>
+      <w:r>
+        <w:rPr>
+          <w:rFonts w:ascii="Segoe UI" w:hAnsi="Segoe UI"/>
+          <w:color w:val="374151"/>
+          <w:sz w:val="18"/>
+        </w:rPr>
+        <w:t>Cetak struk thermal bluetooth, dan pesanan langsung muncul di layar KDS barista.</w:t>
+      </w:r>
+    </w:p>
+    <w:p>
+      <w:pPr>
+        <w:pStyle w:val="ListBullet"/>
+        <w:spacing w:before="20" w:after="40" w:line="276" w:lineRule="auto"/>
+      </w:pPr>
+      <w:r>
+        <w:rPr>
+          <w:rFonts w:ascii="Segoe UI" w:hAnsi="Segoe UI"/>
+          <w:b/>
+          <w:color w:val="1F2937"/>
+          <w:sz w:val="18"/>
+        </w:rPr>
+        <w:t xml:space="preserve">6. Tetap Berjalan Saat Offline: </w:t>
+      </w:r>
+      <w:r>
+        <w:rPr>
+          <w:rFonts w:ascii="Segoe UI" w:hAnsi="Segoe UI"/>
+          <w:color w:val="374151"/>
+          <w:sz w:val="18"/>
+        </w:rPr>
+        <w:t>Transaksi tunai tetap bisa dilakukan saat internet mati dan tersinkron otomatis begitu kembali online.</w:t>
+      </w:r>
+    </w:p>
+    <w:p>
+      <w:pPr>
+        <w:keepNext/>
+        <w:spacing w:before="160" w:after="40"/>
+      </w:pPr>
+      <w:r>
+        <w:rPr>
+          <w:rFonts w:ascii="Segoe UI" w:hAnsi="Segoe UI"/>
+          <w:b/>
+          <w:color w:val="C27835"/>
+          <w:sz w:val="20"/>
+        </w:rPr>
+        <w:t>B. STORE MANAGER / SUPERVISOR (Mengawasi Kas dan Transaksi Outlet)</w:t>
+      </w:r>
+    </w:p>
+    <w:p>
+      <w:pPr>
+        <w:pStyle w:val="ListBullet"/>
+        <w:spacing w:before="20" w:after="40" w:line="276" w:lineRule="auto"/>
+      </w:pPr>
+      <w:r>
+        <w:rPr>
+          <w:rFonts w:ascii="Segoe UI" w:hAnsi="Segoe UI"/>
+          <w:b/>
+          <w:color w:val="1F2937"/>
+          <w:sz w:val="18"/>
+        </w:rPr>
+        <w:t xml:space="preserve">1. Shift &amp; Audit Kas Laci: </w:t>
+      </w:r>
+      <w:r>
+        <w:rPr>
+          <w:rFonts w:ascii="Segoe UI" w:hAnsi="Segoe UI"/>
+          <w:color w:val="374151"/>
+          <w:sz w:val="18"/>
+        </w:rPr>
+        <w:t>Buka dan tutup shift dengan hitung kas laci fisik (cash count). Selisih terdeteksi lewat rekonsiliasi kasir otomatis.</w:t>
+      </w:r>
+    </w:p>
+    <w:p>
+      <w:pPr>
+        <w:pStyle w:val="ListBullet"/>
+        <w:spacing w:before="20" w:after="40" w:line="276" w:lineRule="auto"/>
+      </w:pPr>
+      <w:r>
+        <w:rPr>
+          <w:rFonts w:ascii="Segoe UI" w:hAnsi="Segoe UI"/>
+          <w:b/>
+          <w:color w:val="1F2937"/>
+          <w:sz w:val="18"/>
+        </w:rPr>
+        <w:t xml:space="preserve">2. Otorisasi Pembatalan &amp; Refund: </w:t>
+      </w:r>
+      <w:r>
+        <w:rPr>
+          <w:rFonts w:ascii="Segoe UI" w:hAnsi="Segoe UI"/>
+          <w:color w:val="374151"/>
+          <w:sz w:val="18"/>
+        </w:rPr>
+        <w:t>Pembatalan dan refund transaksi hanya bisa diproses setelah disetujui supervisor.</w:t>
+      </w:r>
+    </w:p>
+    <w:p>
+      <w:pPr>
+        <w:pStyle w:val="ListBullet"/>
+        <w:spacing w:before="20" w:after="40" w:line="276" w:lineRule="auto"/>
+      </w:pPr>
+      <w:r>
+        <w:rPr>
+          <w:rFonts w:ascii="Segoe UI" w:hAnsi="Segoe UI"/>
+          <w:b/>
+          <w:color w:val="1F2937"/>
+          <w:sz w:val="18"/>
+        </w:rPr>
+        <w:t xml:space="preserve">3. Pendapatan Tercatat Otomatis ke ERP: </w:t>
+      </w:r>
+      <w:r>
+        <w:rPr>
+          <w:rFonts w:ascii="Segoe UI" w:hAnsi="Segoe UI"/>
+          <w:color w:val="374151"/>
+          <w:sz w:val="18"/>
+        </w:rPr>
+        <w:t>Setiap transaksi langsung membukukan omzet ke ERP dan mencatat kas masuk, tanpa input ulang.</w:t>
+      </w:r>
+    </w:p>
+    <w:p>
+      <w:pPr>
+        <w:pStyle w:val="ListBullet"/>
+        <w:spacing w:before="20" w:after="40" w:line="276" w:lineRule="auto"/>
+      </w:pPr>
+      <w:r>
+        <w:rPr>
+          <w:rFonts w:ascii="Segoe UI" w:hAnsi="Segoe UI"/>
+          <w:b/>
+          <w:color w:val="1F2937"/>
+          <w:sz w:val="18"/>
+        </w:rPr>
+        <w:t xml:space="preserve">4. Riwayat &amp; Laporan Shift: </w:t>
+      </w:r>
+      <w:r>
+        <w:rPr>
+          <w:rFonts w:ascii="Segoe UI" w:hAnsi="Segoe UI"/>
+          <w:color w:val="374151"/>
+          <w:sz w:val="18"/>
+        </w:rPr>
+        <w:t>Telusuri semua transaksi per shift dan per kasir, lengkap dengan ringkasan tunai dan QRIS.</w:t>
       </w:r>
     </w:p>
     <w:p>

</xml_diff>

<commit_message>
feat: add ProposalApp component and update proposal documentation with KDS features
</commit_message>
<xml_diff>
--- a/Rekomendasi_Solusi_Teknologi_Kopi_Seduhan_Jodi.docx
+++ b/Rekomendasi_Solusi_Teknologi_Kopi_Seduhan_Jodi.docx
@@ -2849,7 +2849,7 @@
           <w:color w:val="374151"/>
           <w:sz w:val="18"/>
         </w:rPr>
-        <w:t>Cetak struk thermal bluetooth, dan pesanan langsung muncul di layar KDS barista.</w:t>
+        <w:t>Cetak struk thermal bluetooth, dan pesanan langsung muncul di layar KDS barista (khusus outlet besar/flagship).</w:t>
       </w:r>
     </w:p>
     <w:p>
@@ -2980,6 +2980,173 @@
           <w:sz w:val="18"/>
         </w:rPr>
         <w:t>Telusuri semua transaksi per shift dan per kasir, lengkap dengan ringkasan tunai dan QRIS.</w:t>
+      </w:r>
+    </w:p>
+    <w:p>
+      <w:pPr>
+        <w:spacing w:after="80"/>
+      </w:pPr>
+    </w:p>
+    <w:p>
+      <w:pPr>
+        <w:keepNext/>
+        <w:spacing w:before="200" w:after="60"/>
+      </w:pPr>
+      <w:r>
+        <w:rPr>
+          <w:rFonts w:ascii="Segoe UI" w:hAnsi="Segoe UI"/>
+          <w:b/>
+          <w:color w:val="4A2E18"/>
+          <w:sz w:val="23"/>
+        </w:rPr>
+        <w:t>Fitur Kunci KDS Layar Barista (Fase 1 Core):</w:t>
+      </w:r>
+    </w:p>
+    <w:p>
+      <w:pPr>
+        <w:spacing w:before="0" w:after="60" w:line="276" w:lineRule="auto"/>
+      </w:pPr>
+      <w:r>
+        <w:rPr>
+          <w:rFonts w:ascii="Segoe UI" w:hAnsi="Segoe UI"/>
+          <w:color w:val="374151"/>
+          <w:sz w:val="19"/>
+        </w:rPr>
+        <w:t>Pengguna: Barista • Platform: Monitor Dapur / Tablet</w:t>
+        <w:br/>
+        <w:t>Layar dapur yang menggantikan kertas bon, sehingga pesanan mengalir cepat dari kasir ke barista tanpa salah baca.</w:t>
+      </w:r>
+    </w:p>
+    <w:tbl>
+      <w:tblPr>
+        <w:tblW w:type="auto" w:w="0"/>
+        <w:jc w:val="center"/>
+        <w:tblLayout w:type="fixed"/>
+        <w:tblLook w:firstColumn="1" w:firstRow="1" w:lastColumn="0" w:lastRow="0" w:noHBand="0" w:noVBand="1" w:val="04A0"/>
+      </w:tblPr>
+      <w:tblGrid>
+        <w:gridCol w:w="9029"/>
+      </w:tblGrid>
+      <w:tr>
+        <w:tc>
+          <w:tcPr>
+            <w:tcW w:type="dxa" w:w="9029"/>
+            <w:shd w:fill="ECFDF5"/>
+            <w:tcMar>
+              <w:top w:w="120" w:type="dxa"/>
+              <w:bottom w:w="120" w:type="dxa"/>
+              <w:left w:w="160" w:type="dxa"/>
+              <w:right w:w="140" w:type="dxa"/>
+            </w:tcMar>
+            <w:tcBorders>
+              <w:top w:val="none"/>
+              <w:left w:val="single" w:sz="24" w:space="0" w:color="059669"/>
+              <w:bottom w:val="none"/>
+              <w:right w:val="none"/>
+            </w:tcBorders>
+          </w:tcPr>
+          <w:p>
+            <w:pPr>
+              <w:spacing w:before="40" w:after="60" w:line="276" w:lineRule="auto"/>
+            </w:pPr>
+            <w:r>
+              <w:rPr>
+                <w:rFonts w:ascii="Segoe UI" w:hAnsi="Segoe UI"/>
+                <w:b/>
+                <w:color w:val="3E2723"/>
+                <w:sz w:val="20"/>
+              </w:rPr>
+              <w:t>Alur Utama KDS Barista:</w:t>
+            </w:r>
+          </w:p>
+          <w:p>
+            <w:pPr>
+              <w:spacing w:before="20" w:after="40" w:line="276" w:lineRule="auto"/>
+            </w:pPr>
+            <w:r>
+              <w:rPr>
+                <w:rFonts w:ascii="Segoe UI" w:hAnsi="Segoe UI"/>
+                <w:color w:val="374151"/>
+                <w:sz w:val="19"/>
+              </w:rPr>
+              <w:t>Pesanan Masuk → Tiket di Layar → Sedang Diracik → Siap Diambil</w:t>
+            </w:r>
+          </w:p>
+        </w:tc>
+      </w:tr>
+    </w:tbl>
+    <w:p>
+      <w:pPr>
+        <w:spacing w:after="80"/>
+      </w:pPr>
+    </w:p>
+    <w:p>
+      <w:pPr>
+        <w:pStyle w:val="ListBullet"/>
+        <w:spacing w:before="20" w:after="40" w:line="276" w:lineRule="auto"/>
+      </w:pPr>
+      <w:r>
+        <w:rPr>
+          <w:rFonts w:ascii="Segoe UI" w:hAnsi="Segoe UI"/>
+          <w:b/>
+          <w:color w:val="1F2937"/>
+          <w:sz w:val="18"/>
+        </w:rPr>
+        <w:t xml:space="preserve">1. Antrean Tiket Real-Time: </w:t>
+      </w:r>
+      <w:r>
+        <w:rPr>
+          <w:rFonts w:ascii="Segoe UI" w:hAnsi="Segoe UI"/>
+          <w:color w:val="374151"/>
+          <w:sz w:val="18"/>
+        </w:rPr>
+        <w:t>Pesanan dari kasir muncul otomatis di layar tanpa kertas bon, lengkap dengan varian dan catatan pelanggan.</w:t>
+      </w:r>
+    </w:p>
+    <w:p>
+      <w:pPr>
+        <w:pStyle w:val="ListBullet"/>
+        <w:spacing w:before="20" w:after="40" w:line="276" w:lineRule="auto"/>
+      </w:pPr>
+      <w:r>
+        <w:rPr>
+          <w:rFonts w:ascii="Segoe UI" w:hAnsi="Segoe UI"/>
+          <w:b/>
+          <w:color w:val="1F2937"/>
+          <w:sz w:val="18"/>
+        </w:rPr>
+        <w:t xml:space="preserve">2. Status Progres per Pesanan: </w:t>
+      </w:r>
+      <w:r>
+        <w:rPr>
+          <w:rFonts w:ascii="Segoe UI" w:hAnsi="Segoe UI"/>
+          <w:color w:val="374151"/>
+          <w:sz w:val="18"/>
+        </w:rPr>
+        <w:t>Ubah status dengan satu sentuhan: Dalam Antrean → Sedang Diracik → Siap Diambil. Perubahan langsung terlihat di POS kasir.</w:t>
+      </w:r>
+    </w:p>
+    <w:p>
+      <w:pPr>
+        <w:pStyle w:val="ListBullet"/>
+        <w:spacing w:before="20" w:after="40" w:line="276" w:lineRule="auto"/>
+      </w:pPr>
+      <w:r>
+        <w:rPr>
+          <w:rFonts w:ascii="Segoe UI" w:hAnsi="Segoe UI"/>
+          <w:b/>
+          <w:color w:val="1F2937"/>
+          <w:sz w:val="18"/>
+        </w:rPr>
+        <w:t xml:space="preserve">3. Timer Waktu Penyajian: </w:t>
+      </w:r>
+      <w:r>
+        <w:rPr>
+          <w:rFonts w:ascii="Segoe UI" w:hAnsi="Segoe UI"/>
+          <w:color w:val="374151"/>
+          <w:sz w:val="18"/>
+        </w:rPr>
+        <w:t>Setiap pesanan punya penghitung waktu, dan warnanya berubah saat mendekati atau melewati target waktu pembuatan.</w:t>
       </w:r>
     </w:p>
     <w:p>

</xml_diff>

<commit_message>
Update proposal documentation and add the ProposalApp UI component.
</commit_message>
<xml_diff>
--- a/Rekomendasi_Solusi_Teknologi_Kopi_Seduhan_Jodi.docx
+++ b/Rekomendasi_Solusi_Teknologi_Kopi_Seduhan_Jodi.docx
@@ -1258,7 +1258,7 @@
                 <w:color w:val="374151"/>
                 <w:sz w:val="18"/>
               </w:rPr>
-              <w:t>App Operasi Outlet</w:t>
+              <w:t>App Pelanggan</w:t>
             </w:r>
           </w:p>
         </w:tc>
@@ -1291,9 +1291,9 @@
                 <w:color w:val="374151"/>
                 <w:sz w:val="18"/>
               </w:rPr>
-              <w:t>Mobile Android</w:t>
+              <w:t>iOS &amp; Android</w:t>
               <w:br/>
-              <w:t>(Store Manager)</w:t>
+              <w:t>(Pelanggan Kopi Seduhan Jodi)</w:t>
             </w:r>
           </w:p>
         </w:tc>
@@ -1326,7 +1326,7 @@
                 <w:color w:val="374151"/>
                 <w:sz w:val="18"/>
               </w:rPr>
-              <w:t>Penerimaan barang (surat jalan), stock opname fisik, pencatatan waste, pengajuan kas kecil.</w:t>
+              <w:t>Order online (Pick-up / Delivery), QRIS/E-Wallet, loyalty poin, e-voucher promo.</w:t>
             </w:r>
           </w:p>
         </w:tc>
@@ -1359,7 +1359,7 @@
                 <w:color w:val="374151"/>
                 <w:sz w:val="18"/>
               </w:rPr>
-              <w:t>Fase 1</w:t>
+              <w:t>Fase 2</w:t>
             </w:r>
           </w:p>
         </w:tc>
@@ -1427,7 +1427,7 @@
                 <w:color w:val="374151"/>
                 <w:sz w:val="18"/>
               </w:rPr>
-              <w:t>App Pelanggan</w:t>
+              <w:t>CRM &amp; Promo Panel</w:t>
             </w:r>
           </w:p>
         </w:tc>
@@ -1460,9 +1460,9 @@
                 <w:color w:val="374151"/>
                 <w:sz w:val="18"/>
               </w:rPr>
-              <w:t>iOS &amp; Android</w:t>
+              <w:t>Web Backoffice</w:t>
               <w:br/>
-              <w:t>(Pelanggan Kopi Seduhan Jodi)</w:t>
+              <w:t>(Tim Marketing)</w:t>
             </w:r>
           </w:p>
         </w:tc>
@@ -1495,7 +1495,7 @@
                 <w:color w:val="374151"/>
                 <w:sz w:val="18"/>
               </w:rPr>
-              <w:t>Order online (Pick-up / Delivery), QRIS/E-Wallet, loyalty poin, e-voucher promo.</w:t>
+              <w:t>Kelola voucher diskon, blast push notification penawaran promo, segmentasi pelanggan.</w:t>
             </w:r>
           </w:p>
         </w:tc>
@@ -1596,7 +1596,7 @@
                 <w:color w:val="374151"/>
                 <w:sz w:val="18"/>
               </w:rPr>
-              <w:t>CRM &amp; Promo Panel</w:t>
+              <w:t>Portal Mitra / Investor</w:t>
             </w:r>
           </w:p>
         </w:tc>
@@ -1629,9 +1629,9 @@
                 <w:color w:val="374151"/>
                 <w:sz w:val="18"/>
               </w:rPr>
-              <w:t>Web Backoffice</w:t>
+              <w:t>Web Portal (Secure)</w:t>
               <w:br/>
-              <w:t>(Tim Marketing)</w:t>
+              <w:t>(Mitra Pemilik Cabang)</w:t>
             </w:r>
           </w:p>
         </w:tc>
@@ -1664,7 +1664,7 @@
                 <w:color w:val="374151"/>
                 <w:sz w:val="18"/>
               </w:rPr>
-              <w:t>Kelola voucher diskon, blast push notification penawaran promo, segmentasi pelanggan.</w:t>
+              <w:t>Laporan real-time: omzet cabang, rincian biaya, HPP riil, dan estimasi bagi hasil.</w:t>
             </w:r>
           </w:p>
         </w:tc>
@@ -1697,7 +1697,7 @@
                 <w:color w:val="374151"/>
                 <w:sz w:val="18"/>
               </w:rPr>
-              <w:t>Fase 2</w:t>
+              <w:t>Fase 3</w:t>
             </w:r>
           </w:p>
         </w:tc>
@@ -1765,7 +1765,7 @@
                 <w:color w:val="374151"/>
                 <w:sz w:val="18"/>
               </w:rPr>
-              <w:t>Portal Mitra / Investor</w:t>
+              <w:t>Owner Dashboard &amp; HR</w:t>
             </w:r>
           </w:p>
         </w:tc>
@@ -1774,175 +1774,6 @@
             <w:tcW w:type="dxa" w:w="1944"/>
             <w:vAlign w:val="center"/>
             <w:shd w:fill="FBF9F5"/>
-            <w:tcMar>
-              <w:top w:w="90" w:type="dxa"/>
-              <w:bottom w:w="90" w:type="dxa"/>
-              <w:left w:w="120" w:type="dxa"/>
-              <w:right w:w="120" w:type="dxa"/>
-            </w:tcMar>
-            <w:tcBorders>
-              <w:top w:val="single" w:sz="4" w:space="0" w:color="E5E0D8"/>
-              <w:left w:val="none"/>
-              <w:bottom w:val="single" w:sz="4" w:space="0" w:color="E5E0D8"/>
-              <w:right w:val="none"/>
-            </w:tcBorders>
-          </w:tcPr>
-          <w:p>
-            <w:pPr>
-              <w:spacing w:before="20" w:after="20" w:line="276" w:lineRule="auto"/>
-              <w:jc w:val="left"/>
-            </w:pPr>
-            <w:r>
-              <w:rPr>
-                <w:rFonts w:ascii="Segoe UI" w:hAnsi="Segoe UI"/>
-                <w:color w:val="374151"/>
-                <w:sz w:val="18"/>
-              </w:rPr>
-              <w:t>Web Portal (Secure)</w:t>
-              <w:br/>
-              <w:t>(Mitra Pemilik Cabang)</w:t>
-            </w:r>
-          </w:p>
-        </w:tc>
-        <w:tc>
-          <w:tcPr>
-            <w:tcW w:type="dxa" w:w="3744"/>
-            <w:vAlign w:val="center"/>
-            <w:shd w:fill="FBF9F5"/>
-            <w:tcMar>
-              <w:top w:w="90" w:type="dxa"/>
-              <w:bottom w:w="90" w:type="dxa"/>
-              <w:left w:w="120" w:type="dxa"/>
-              <w:right w:w="120" w:type="dxa"/>
-            </w:tcMar>
-            <w:tcBorders>
-              <w:top w:val="single" w:sz="4" w:space="0" w:color="E5E0D8"/>
-              <w:left w:val="none"/>
-              <w:bottom w:val="single" w:sz="4" w:space="0" w:color="E5E0D8"/>
-              <w:right w:val="none"/>
-            </w:tcBorders>
-          </w:tcPr>
-          <w:p>
-            <w:pPr>
-              <w:spacing w:before="20" w:after="20" w:line="276" w:lineRule="auto"/>
-              <w:jc w:val="left"/>
-            </w:pPr>
-            <w:r>
-              <w:rPr>
-                <w:rFonts w:ascii="Segoe UI" w:hAnsi="Segoe UI"/>
-                <w:color w:val="374151"/>
-                <w:sz w:val="18"/>
-              </w:rPr>
-              <w:t>Laporan real-time: omzet cabang, rincian biaya, HPP riil, dan estimasi bagi hasil.</w:t>
-            </w:r>
-          </w:p>
-        </w:tc>
-        <w:tc>
-          <w:tcPr>
-            <w:tcW w:type="dxa" w:w="821"/>
-            <w:vAlign w:val="center"/>
-            <w:shd w:fill="FBF9F5"/>
-            <w:tcMar>
-              <w:top w:w="90" w:type="dxa"/>
-              <w:bottom w:w="90" w:type="dxa"/>
-              <w:left w:w="120" w:type="dxa"/>
-              <w:right w:w="120" w:type="dxa"/>
-            </w:tcMar>
-            <w:tcBorders>
-              <w:top w:val="single" w:sz="4" w:space="0" w:color="E5E0D8"/>
-              <w:left w:val="none"/>
-              <w:bottom w:val="single" w:sz="4" w:space="0" w:color="E5E0D8"/>
-              <w:right w:val="none"/>
-            </w:tcBorders>
-          </w:tcPr>
-          <w:p>
-            <w:pPr>
-              <w:spacing w:before="20" w:after="20" w:line="276" w:lineRule="auto"/>
-              <w:jc w:val="center"/>
-            </w:pPr>
-            <w:r>
-              <w:rPr>
-                <w:rFonts w:ascii="Segoe UI" w:hAnsi="Segoe UI"/>
-                <w:color w:val="374151"/>
-                <w:sz w:val="18"/>
-              </w:rPr>
-              <w:t>Fase 3</w:t>
-            </w:r>
-          </w:p>
-        </w:tc>
-      </w:tr>
-      <w:tr>
-        <w:tc>
-          <w:tcPr>
-            <w:tcW w:type="dxa" w:w="504"/>
-            <w:vAlign w:val="center"/>
-            <w:shd w:fill="FFFFFF"/>
-            <w:tcMar>
-              <w:top w:w="90" w:type="dxa"/>
-              <w:bottom w:w="90" w:type="dxa"/>
-              <w:left w:w="120" w:type="dxa"/>
-              <w:right w:w="120" w:type="dxa"/>
-            </w:tcMar>
-            <w:tcBorders>
-              <w:top w:val="single" w:sz="4" w:space="0" w:color="E5E0D8"/>
-              <w:left w:val="none"/>
-              <w:bottom w:val="single" w:sz="4" w:space="0" w:color="E5E0D8"/>
-              <w:right w:val="none"/>
-            </w:tcBorders>
-          </w:tcPr>
-          <w:p>
-            <w:pPr>
-              <w:spacing w:before="20" w:after="20" w:line="276" w:lineRule="auto"/>
-              <w:jc w:val="center"/>
-            </w:pPr>
-            <w:r>
-              <w:rPr>
-                <w:rFonts w:ascii="Segoe UI" w:hAnsi="Segoe UI"/>
-                <w:color w:val="374151"/>
-                <w:sz w:val="18"/>
-              </w:rPr>
-              <w:t>8</w:t>
-            </w:r>
-          </w:p>
-        </w:tc>
-        <w:tc>
-          <w:tcPr>
-            <w:tcW w:type="dxa" w:w="2016"/>
-            <w:vAlign w:val="center"/>
-            <w:shd w:fill="FFFFFF"/>
-            <w:tcMar>
-              <w:top w:w="90" w:type="dxa"/>
-              <w:bottom w:w="90" w:type="dxa"/>
-              <w:left w:w="120" w:type="dxa"/>
-              <w:right w:w="120" w:type="dxa"/>
-            </w:tcMar>
-            <w:tcBorders>
-              <w:top w:val="single" w:sz="4" w:space="0" w:color="E5E0D8"/>
-              <w:left w:val="none"/>
-              <w:bottom w:val="single" w:sz="4" w:space="0" w:color="E5E0D8"/>
-              <w:right w:val="none"/>
-            </w:tcBorders>
-          </w:tcPr>
-          <w:p>
-            <w:pPr>
-              <w:spacing w:before="20" w:after="20" w:line="276" w:lineRule="auto"/>
-              <w:jc w:val="left"/>
-            </w:pPr>
-            <w:r>
-              <w:rPr>
-                <w:rFonts w:ascii="Segoe UI" w:hAnsi="Segoe UI"/>
-                <w:color w:val="374151"/>
-                <w:sz w:val="18"/>
-              </w:rPr>
-              <w:t>Owner Dashboard &amp; HR</w:t>
-            </w:r>
-          </w:p>
-        </w:tc>
-        <w:tc>
-          <w:tcPr>
-            <w:tcW w:type="dxa" w:w="1944"/>
-            <w:vAlign w:val="center"/>
-            <w:shd w:fill="FFFFFF"/>
             <w:tcMar>
               <w:top w:w="90" w:type="dxa"/>
               <w:bottom w:w="90" w:type="dxa"/>
@@ -1977,7 +1808,7 @@
           <w:tcPr>
             <w:tcW w:type="dxa" w:w="3744"/>
             <w:vAlign w:val="center"/>
-            <w:shd w:fill="FFFFFF"/>
+            <w:shd w:fill="FBF9F5"/>
             <w:tcMar>
               <w:top w:w="90" w:type="dxa"/>
               <w:bottom w:w="90" w:type="dxa"/>
@@ -2010,7 +1841,7 @@
           <w:tcPr>
             <w:tcW w:type="dxa" w:w="821"/>
             <w:vAlign w:val="center"/>
-            <w:shd w:fill="FFFFFF"/>
+            <w:shd w:fill="FBF9F5"/>
             <w:tcMar>
               <w:top w:w="90" w:type="dxa"/>
               <w:bottom w:w="90" w:type="dxa"/>
@@ -3425,7 +3256,7 @@
                 <w:color w:val="374151"/>
                 <w:sz w:val="18"/>
               </w:rPr>
-              <w:t>ERP Backoffice, POS Kasir, KDS Barista, App Operasi Outlet</w:t>
+              <w:t>ERP Backoffice, POS Kasir, KDS Barista</w:t>
             </w:r>
           </w:p>
         </w:tc>

</xml_diff>

<commit_message>
feat: replace mobile app with QR self-order feature and add proposal React application component
</commit_message>
<xml_diff>
--- a/Rekomendasi_Solusi_Teknologi_Kopi_Seduhan_Jodi.docx
+++ b/Rekomendasi_Solusi_Teknologi_Kopi_Seduhan_Jodi.docx
@@ -1258,7 +1258,7 @@
                 <w:color w:val="374151"/>
                 <w:sz w:val="18"/>
               </w:rPr>
-              <w:t>App Pelanggan</w:t>
+              <w:t>Menu QR (Self-Order)</w:t>
             </w:r>
           </w:p>
         </w:tc>
@@ -1291,9 +1291,9 @@
                 <w:color w:val="374151"/>
                 <w:sz w:val="18"/>
               </w:rPr>
-              <w:t>iOS &amp; Android</w:t>
+              <w:t>Web Mobile</w:t>
               <w:br/>
-              <w:t>(Pelanggan Kopi Seduhan Jodi)</w:t>
+              <w:t>(Pelanggan - Tanpa Install)</w:t>
             </w:r>
           </w:p>
         </w:tc>
@@ -1326,7 +1326,7 @@
                 <w:color w:val="374151"/>
                 <w:sz w:val="18"/>
               </w:rPr>
-              <w:t>Order online (Pick-up / Delivery), QRIS/E-Wallet, loyalty poin, e-voucher promo.</w:t>
+              <w:t>Scan QR meja/counter, pilih menu &amp; varian, bayar QRIS/e-wallet, status pesanan live.</w:t>
             </w:r>
           </w:p>
         </w:tc>
@@ -2982,6 +2982,242 @@
     </w:p>
     <w:p>
       <w:pPr>
+        <w:spacing w:after="80"/>
+      </w:pPr>
+    </w:p>
+    <w:p>
+      <w:pPr>
+        <w:keepNext/>
+        <w:spacing w:before="200" w:after="60"/>
+      </w:pPr>
+      <w:r>
+        <w:rPr>
+          <w:rFonts w:ascii="Segoe UI" w:hAnsi="Segoe UI"/>
+          <w:b/>
+          <w:color w:val="4A2E18"/>
+          <w:sz w:val="23"/>
+        </w:rPr>
+        <w:t>Fitur Kunci Menu QR Self-Order (Fase 2 Omni):</w:t>
+      </w:r>
+    </w:p>
+    <w:p>
+      <w:pPr>
+        <w:spacing w:before="0" w:after="60" w:line="276" w:lineRule="auto"/>
+      </w:pPr>
+      <w:r>
+        <w:rPr>
+          <w:rFonts w:ascii="Segoe UI" w:hAnsi="Segoe UI"/>
+          <w:color w:val="374151"/>
+          <w:sz w:val="19"/>
+        </w:rPr>
+        <w:t>Pengguna: Pelanggan Kopi Seduhan Jodi • Platform: Web Mobile (tanpa instal aplikasi)</w:t>
+        <w:br/>
+        <w:t>Pelanggan memesan dan membayar sendiri dari HP lewat scan QR, pesanan langsung masuk ke kasir dan dapur.</w:t>
+      </w:r>
+    </w:p>
+    <w:tbl>
+      <w:tblPr>
+        <w:tblW w:type="auto" w:w="0"/>
+        <w:jc w:val="center"/>
+        <w:tblLayout w:type="fixed"/>
+        <w:tblLook w:firstColumn="1" w:firstRow="1" w:lastColumn="0" w:lastRow="0" w:noHBand="0" w:noVBand="1" w:val="04A0"/>
+      </w:tblPr>
+      <w:tblGrid>
+        <w:gridCol w:w="9029"/>
+      </w:tblGrid>
+      <w:tr>
+        <w:tc>
+          <w:tcPr>
+            <w:tcW w:type="dxa" w:w="9029"/>
+            <w:shd w:fill="F5F3FF"/>
+            <w:tcMar>
+              <w:top w:w="120" w:type="dxa"/>
+              <w:bottom w:w="120" w:type="dxa"/>
+              <w:left w:w="160" w:type="dxa"/>
+              <w:right w:w="140" w:type="dxa"/>
+            </w:tcMar>
+            <w:tcBorders>
+              <w:top w:val="none"/>
+              <w:left w:val="single" w:sz="24" w:space="0" w:color="7C3AED"/>
+              <w:bottom w:val="none"/>
+              <w:right w:val="none"/>
+            </w:tcBorders>
+          </w:tcPr>
+          <w:p>
+            <w:pPr>
+              <w:spacing w:before="40" w:after="60" w:line="276" w:lineRule="auto"/>
+            </w:pPr>
+            <w:r>
+              <w:rPr>
+                <w:rFonts w:ascii="Segoe UI" w:hAnsi="Segoe UI"/>
+                <w:b/>
+                <w:color w:val="3E2723"/>
+                <w:sz w:val="20"/>
+              </w:rPr>
+              <w:t>Alur Utama Menu QR:</w:t>
+            </w:r>
+          </w:p>
+          <w:p>
+            <w:pPr>
+              <w:spacing w:before="20" w:after="40" w:line="276" w:lineRule="auto"/>
+            </w:pPr>
+            <w:r>
+              <w:rPr>
+                <w:rFonts w:ascii="Segoe UI" w:hAnsi="Segoe UI"/>
+                <w:color w:val="374151"/>
+                <w:sz w:val="19"/>
+              </w:rPr>
+              <w:t>Scan QR → Pilih Menu → Bayar → Pantau Status → Ambil Pesanan</w:t>
+            </w:r>
+          </w:p>
+        </w:tc>
+      </w:tr>
+    </w:tbl>
+    <w:p>
+      <w:pPr>
+        <w:spacing w:after="80"/>
+      </w:pPr>
+    </w:p>
+    <w:p>
+      <w:pPr>
+        <w:pStyle w:val="ListBullet"/>
+        <w:spacing w:before="20" w:after="40" w:line="276" w:lineRule="auto"/>
+      </w:pPr>
+      <w:r>
+        <w:rPr>
+          <w:rFonts w:ascii="Segoe UI" w:hAnsi="Segoe UI"/>
+          <w:b/>
+          <w:color w:val="1F2937"/>
+          <w:sz w:val="18"/>
+        </w:rPr>
+        <w:t xml:space="preserve">1. Scan QR, Langsung Pesan: </w:t>
+      </w:r>
+      <w:r>
+        <w:rPr>
+          <w:rFonts w:ascii="Segoe UI" w:hAnsi="Segoe UI"/>
+          <w:color w:val="374151"/>
+          <w:sz w:val="18"/>
+        </w:rPr>
+        <w:t>Cukup scan QR di meja atau counter, tanpa unduh aplikasi dan tanpa daftar akun. Pelanggan memilih makan di tempat atau bawa pulang.</w:t>
+      </w:r>
+    </w:p>
+    <w:p>
+      <w:pPr>
+        <w:pStyle w:val="ListBullet"/>
+        <w:spacing w:before="20" w:after="40" w:line="276" w:lineRule="auto"/>
+      </w:pPr>
+      <w:r>
+        <w:rPr>
+          <w:rFonts w:ascii="Segoe UI" w:hAnsi="Segoe UI"/>
+          <w:b/>
+          <w:color w:val="1F2937"/>
+          <w:sz w:val="18"/>
+        </w:rPr>
+        <w:t xml:space="preserve">2. Menu Lengkap dengan Varian: </w:t>
+      </w:r>
+      <w:r>
+        <w:rPr>
+          <w:rFonts w:ascii="Segoe UI" w:hAnsi="Segoe UI"/>
+          <w:color w:val="374151"/>
+          <w:sz w:val="18"/>
+        </w:rPr>
+        <w:t>Menu tampil sesuai outlet, lengkap dengan foto, harga, dan varian (ukuran cup, takaran gula, susu alternatif seperti oatmilk). Menu yang bahannya habis otomatis ditandai habis.</w:t>
+      </w:r>
+    </w:p>
+    <w:p>
+      <w:pPr>
+        <w:pStyle w:val="ListBullet"/>
+        <w:spacing w:before="20" w:after="40" w:line="276" w:lineRule="auto"/>
+      </w:pPr>
+      <w:r>
+        <w:rPr>
+          <w:rFonts w:ascii="Segoe UI" w:hAnsi="Segoe UI"/>
+          <w:b/>
+          <w:color w:val="1F2937"/>
+          <w:sz w:val="18"/>
+        </w:rPr>
+        <w:t xml:space="preserve">3. Bayar Langsung di HP: </w:t>
+      </w:r>
+      <w:r>
+        <w:rPr>
+          <w:rFonts w:ascii="Segoe UI" w:hAnsi="Segoe UI"/>
+          <w:color w:val="374151"/>
+          <w:sz w:val="18"/>
+        </w:rPr>
+        <w:t>Pembayaran QRIS dan e-wallet lewat Midtrans, langsung dari halaman pesanan.</w:t>
+      </w:r>
+    </w:p>
+    <w:p>
+      <w:pPr>
+        <w:pStyle w:val="ListBullet"/>
+        <w:spacing w:before="20" w:after="40" w:line="276" w:lineRule="auto"/>
+      </w:pPr>
+      <w:r>
+        <w:rPr>
+          <w:rFonts w:ascii="Segoe UI" w:hAnsi="Segoe UI"/>
+          <w:b/>
+          <w:color w:val="1F2937"/>
+          <w:sz w:val="18"/>
+        </w:rPr>
+        <w:t xml:space="preserve">4. Pesanan Langsung ke Kasir &amp; Dapur: </w:t>
+      </w:r>
+      <w:r>
+        <w:rPr>
+          <w:rFonts w:ascii="Segoe UI" w:hAnsi="Segoe UI"/>
+          <w:color w:val="374151"/>
+          <w:sz w:val="18"/>
+        </w:rPr>
+        <w:t>Setelah pembayaran berhasil, pesanan masuk otomatis ke POS dan layar barista tanpa diketik ulang, sehingga antrean di kasir berkurang.</w:t>
+      </w:r>
+    </w:p>
+    <w:p>
+      <w:pPr>
+        <w:pStyle w:val="ListBullet"/>
+        <w:spacing w:before="20" w:after="40" w:line="276" w:lineRule="auto"/>
+      </w:pPr>
+      <w:r>
+        <w:rPr>
+          <w:rFonts w:ascii="Segoe UI" w:hAnsi="Segoe UI"/>
+          <w:b/>
+          <w:color w:val="1F2937"/>
+          <w:sz w:val="18"/>
+        </w:rPr>
+        <w:t xml:space="preserve">5. Pantau Status Pesanan Live: </w:t>
+      </w:r>
+      <w:r>
+        <w:rPr>
+          <w:rFonts w:ascii="Segoe UI" w:hAnsi="Segoe UI"/>
+          <w:color w:val="374151"/>
+          <w:sz w:val="18"/>
+        </w:rPr>
+        <w:t>Pelanggan melihat progres minumannya: Dalam Antrean → Sedang Diracik → Siap Diambil.</w:t>
+      </w:r>
+    </w:p>
+    <w:p>
+      <w:pPr>
+        <w:pStyle w:val="ListBullet"/>
+        <w:spacing w:before="20" w:after="40" w:line="276" w:lineRule="auto"/>
+      </w:pPr>
+      <w:r>
+        <w:rPr>
+          <w:rFonts w:ascii="Segoe UI" w:hAnsi="Segoe UI"/>
+          <w:b/>
+          <w:color w:val="1F2937"/>
+          <w:sz w:val="18"/>
+        </w:rPr>
+        <w:t xml:space="preserve">6. Voucher &amp; Promo: </w:t>
+      </w:r>
+      <w:r>
+        <w:rPr>
+          <w:rFonts w:ascii="Segoe UI" w:hAnsi="Segoe UI"/>
+          <w:color w:val="374151"/>
+          <w:sz w:val="18"/>
+        </w:rPr>
+        <w:t>Pelanggan memasukkan kode voucher saat memesan. Promo dibuat dan dikelola dari Panel CRM.</w:t>
+      </w:r>
+    </w:p>
+    <w:p>
+      <w:pPr>
         <w:keepNext/>
         <w:spacing w:before="280" w:after="100"/>
         <w:pBdr>
@@ -3390,7 +3626,7 @@
                 <w:color w:val="374151"/>
                 <w:sz w:val="18"/>
               </w:rPr>
-              <w:t>Mobile App Pelanggan (iOS &amp; Android) + Panel Promo CRM</w:t>
+              <w:t>Menu QR Self-Order (Web Mobile) + Panel Promo CRM</w:t>
             </w:r>
           </w:p>
         </w:tc>

</xml_diff>

<commit_message>
refactor: add ProposalApp component and update documentation and scripts for Kopi Jodi proposal ecosystem
</commit_message>
<xml_diff>
--- a/Rekomendasi_Solusi_Teknologi_Kopi_Seduhan_Jodi.docx
+++ b/Rekomendasi_Solusi_Teknologi_Kopi_Seduhan_Jodi.docx
@@ -1258,7 +1258,7 @@
                 <w:color w:val="374151"/>
                 <w:sz w:val="18"/>
               </w:rPr>
-              <w:t>Menu QR (Self-Order)</w:t>
+              <w:t>Menu QR (Web App)</w:t>
             </w:r>
           </w:p>
         </w:tc>
@@ -1326,7 +1326,7 @@
                 <w:color w:val="374151"/>
                 <w:sz w:val="18"/>
               </w:rPr>
-              <w:t>Scan QR meja/counter, pilih menu &amp; varian, bayar QRIS/e-wallet, status pesanan live.</w:t>
+              <w:t>Scan QR buka Web App menu di browser HP, pilih varian, bayar QRIS, status live.</w:t>
             </w:r>
           </w:p>
         </w:tc>

</xml_diff>

<commit_message>
docs: add usecase matrix and proposal documents, and update proposal content and markdown files
</commit_message>
<xml_diff>
--- a/Rekomendasi_Solusi_Teknologi_Kopi_Seduhan_Jodi.docx
+++ b/Rekomendasi_Solusi_Teknologi_Kopi_Seduhan_Jodi.docx
@@ -1427,7 +1427,7 @@
                 <w:color w:val="374151"/>
                 <w:sz w:val="18"/>
               </w:rPr>
-              <w:t>CRM &amp; Promo Panel</w:t>
+              <w:t>Promo &amp; Voucher Panel</w:t>
             </w:r>
           </w:p>
         </w:tc>
@@ -1460,7 +1460,7 @@
                 <w:color w:val="374151"/>
                 <w:sz w:val="18"/>
               </w:rPr>
-              <w:t>Web Backoffice</w:t>
+              <w:t>Web Desktop</w:t>
               <w:br/>
               <w:t>(Tim Marketing)</w:t>
             </w:r>
@@ -1495,7 +1495,7 @@
                 <w:color w:val="374151"/>
                 <w:sz w:val="18"/>
               </w:rPr>
-              <w:t>Kelola voucher diskon, blast push notification penawaran promo, segmentasi pelanggan.</w:t>
+              <w:t>Buat promo sekali, langsung berlaku di kasir &amp; Menu QR, pantau kuota dan efektivitas omzet.</w:t>
             </w:r>
           </w:p>
         </w:tc>
@@ -3213,7 +3213,243 @@
           <w:color w:val="374151"/>
           <w:sz w:val="18"/>
         </w:rPr>
-        <w:t>Pelanggan memasukkan kode voucher saat memesan. Promo dibuat dan dikelola dari Panel CRM.</w:t>
+        <w:t>Pelanggan memasukkan kode voucher saat memesan. Promo dibuat dan dikelola dari Promo &amp; Voucher Panel.</w:t>
+      </w:r>
+    </w:p>
+    <w:p>
+      <w:pPr>
+        <w:spacing w:after="80"/>
+      </w:pPr>
+    </w:p>
+    <w:p>
+      <w:pPr>
+        <w:keepNext/>
+        <w:spacing w:before="200" w:after="60"/>
+      </w:pPr>
+      <w:r>
+        <w:rPr>
+          <w:rFonts w:ascii="Segoe UI" w:hAnsi="Segoe UI"/>
+          <w:b/>
+          <w:color w:val="4A2E18"/>
+          <w:sz w:val="23"/>
+        </w:rPr>
+        <w:t>Fitur Kunci Promo &amp; Voucher Panel (Fase 2 Omni):</w:t>
+      </w:r>
+    </w:p>
+    <w:p>
+      <w:pPr>
+        <w:spacing w:before="0" w:after="60" w:line="276" w:lineRule="auto"/>
+      </w:pPr>
+      <w:r>
+        <w:rPr>
+          <w:rFonts w:ascii="Segoe UI" w:hAnsi="Segoe UI"/>
+          <w:color w:val="374151"/>
+          <w:sz w:val="19"/>
+        </w:rPr>
+        <w:t>Pengguna: Tim Marketing &amp; Promosi • Platform: Desktop Web Browser</w:t>
+        <w:br/>
+        <w:t>Buat promo sekali, langsung berlaku di kasir dan Menu QR, lalu pantau hasilnya.</w:t>
+      </w:r>
+    </w:p>
+    <w:tbl>
+      <w:tblPr>
+        <w:tblW w:type="auto" w:w="0"/>
+        <w:jc w:val="center"/>
+        <w:tblLayout w:type="fixed"/>
+        <w:tblLook w:firstColumn="1" w:firstRow="1" w:lastColumn="0" w:lastRow="0" w:noHBand="0" w:noVBand="1" w:val="04A0"/>
+      </w:tblPr>
+      <w:tblGrid>
+        <w:gridCol w:w="9029"/>
+      </w:tblGrid>
+      <w:tr>
+        <w:tc>
+          <w:tcPr>
+            <w:tcW w:type="dxa" w:w="9029"/>
+            <w:shd w:fill="FFF1F2"/>
+            <w:tcMar>
+              <w:top w:w="120" w:type="dxa"/>
+              <w:bottom w:w="120" w:type="dxa"/>
+              <w:left w:w="160" w:type="dxa"/>
+              <w:right w:w="140" w:type="dxa"/>
+            </w:tcMar>
+            <w:tcBorders>
+              <w:top w:val="none"/>
+              <w:left w:val="single" w:sz="24" w:space="0" w:color="E11D48"/>
+              <w:bottom w:val="none"/>
+              <w:right w:val="none"/>
+            </w:tcBorders>
+          </w:tcPr>
+          <w:p>
+            <w:pPr>
+              <w:spacing w:before="40" w:after="60" w:line="276" w:lineRule="auto"/>
+            </w:pPr>
+            <w:r>
+              <w:rPr>
+                <w:rFonts w:ascii="Segoe UI" w:hAnsi="Segoe UI"/>
+                <w:b/>
+                <w:color w:val="3E2723"/>
+                <w:sz w:val="20"/>
+              </w:rPr>
+              <w:t>Alur Utama Promo &amp; Voucher Panel:</w:t>
+            </w:r>
+          </w:p>
+          <w:p>
+            <w:pPr>
+              <w:spacing w:before="20" w:after="40" w:line="276" w:lineRule="auto"/>
+            </w:pPr>
+            <w:r>
+              <w:rPr>
+                <w:rFonts w:ascii="Segoe UI" w:hAnsi="Segoe UI"/>
+                <w:color w:val="374151"/>
+                <w:sz w:val="19"/>
+              </w:rPr>
+              <w:t>Buat Voucher → Atur Cakupan → Pratinjau → Publikasikan → Pantau Hasil</w:t>
+            </w:r>
+          </w:p>
+        </w:tc>
+      </w:tr>
+    </w:tbl>
+    <w:p>
+      <w:pPr>
+        <w:spacing w:after="80"/>
+      </w:pPr>
+    </w:p>
+    <w:p>
+      <w:pPr>
+        <w:pStyle w:val="ListBullet"/>
+        <w:spacing w:before="20" w:after="40" w:line="276" w:lineRule="auto"/>
+      </w:pPr>
+      <w:r>
+        <w:rPr>
+          <w:rFonts w:ascii="Segoe UI" w:hAnsi="Segoe UI"/>
+          <w:b/>
+          <w:color w:val="1F2937"/>
+          <w:sz w:val="18"/>
+        </w:rPr>
+        <w:t xml:space="preserve">1. Voucher Diskon Nominal &amp; Persentase: </w:t>
+      </w:r>
+      <w:r>
+        <w:rPr>
+          <w:rFonts w:ascii="Segoe UI" w:hAnsi="Segoe UI"/>
+          <w:color w:val="374151"/>
+          <w:sz w:val="18"/>
+        </w:rPr>
+        <w:t>Buat voucher dengan kode, masa berlaku, kuota pemakaian, dan minimum belanja.</w:t>
+      </w:r>
+    </w:p>
+    <w:p>
+      <w:pPr>
+        <w:pStyle w:val="ListBullet"/>
+        <w:spacing w:before="20" w:after="40" w:line="276" w:lineRule="auto"/>
+      </w:pPr>
+      <w:r>
+        <w:rPr>
+          <w:rFonts w:ascii="Segoe UI" w:hAnsi="Segoe UI"/>
+          <w:b/>
+          <w:color w:val="1F2937"/>
+          <w:sz w:val="18"/>
+        </w:rPr>
+        <w:t xml:space="preserve">2. Semua Outlet atau Outlet Tertentu: </w:t>
+      </w:r>
+      <w:r>
+        <w:rPr>
+          <w:rFonts w:ascii="Segoe UI" w:hAnsi="Segoe UI"/>
+          <w:color w:val="374151"/>
+          <w:sz w:val="18"/>
+        </w:rPr>
+        <w:t>Promo bisa berlaku di seluruh outlet atau dibatasi untuk outlet pilihan.</w:t>
+      </w:r>
+    </w:p>
+    <w:p>
+      <w:pPr>
+        <w:pStyle w:val="ListBullet"/>
+        <w:spacing w:before="20" w:after="40" w:line="276" w:lineRule="auto"/>
+      </w:pPr>
+      <w:r>
+        <w:rPr>
+          <w:rFonts w:ascii="Segoe UI" w:hAnsi="Segoe UI"/>
+          <w:b/>
+          <w:color w:val="1F2937"/>
+          <w:sz w:val="18"/>
+        </w:rPr>
+        <w:t xml:space="preserve">3. Berlaku di Kasir &amp; Menu QR: </w:t>
+      </w:r>
+      <w:r>
+        <w:rPr>
+          <w:rFonts w:ascii="Segoe UI" w:hAnsi="Segoe UI"/>
+          <w:color w:val="374151"/>
+          <w:sz w:val="18"/>
+        </w:rPr>
+        <w:t>Satu voucher dipakai di dua tempat: pelanggan memasukkan kode di Menu QR, atau kasir menerapkannya di POS.</w:t>
+      </w:r>
+    </w:p>
+    <w:p>
+      <w:pPr>
+        <w:pStyle w:val="ListBullet"/>
+        <w:spacing w:before="20" w:after="40" w:line="276" w:lineRule="auto"/>
+      </w:pPr>
+      <w:r>
+        <w:rPr>
+          <w:rFonts w:ascii="Segoe UI" w:hAnsi="Segoe UI"/>
+          <w:b/>
+          <w:color w:val="1F2937"/>
+          <w:sz w:val="18"/>
+        </w:rPr>
+        <w:t xml:space="preserve">4. Pratinjau Sebelum Dipublikasikan: </w:t>
+      </w:r>
+      <w:r>
+        <w:rPr>
+          <w:rFonts w:ascii="Segoe UI" w:hAnsi="Segoe UI"/>
+          <w:color w:val="374151"/>
+          <w:sz w:val="18"/>
+        </w:rPr>
+        <w:t>Lihat tampilan voucher persis seperti yang dilihat pelanggan, lalu publikasikan bila sudah sesuai.</w:t>
+      </w:r>
+    </w:p>
+    <w:p>
+      <w:pPr>
+        <w:pStyle w:val="ListBullet"/>
+        <w:spacing w:before="20" w:after="40" w:line="276" w:lineRule="auto"/>
+      </w:pPr>
+      <w:r>
+        <w:rPr>
+          <w:rFonts w:ascii="Segoe UI" w:hAnsi="Segoe UI"/>
+          <w:b/>
+          <w:color w:val="1F2937"/>
+          <w:sz w:val="18"/>
+        </w:rPr>
+        <w:t xml:space="preserve">5. Pantau Pemakaian Real-Time: </w:t>
+      </w:r>
+      <w:r>
+        <w:rPr>
+          <w:rFonts w:ascii="Segoe UI" w:hAnsi="Segoe UI"/>
+          <w:color w:val="374151"/>
+          <w:sz w:val="18"/>
+        </w:rPr>
+        <w:t>Lihat berapa kali voucher dipakai, di outlet mana, dan berapa sisa kuotanya.</w:t>
+      </w:r>
+    </w:p>
+    <w:p>
+      <w:pPr>
+        <w:pStyle w:val="ListBullet"/>
+        <w:spacing w:before="20" w:after="40" w:line="276" w:lineRule="auto"/>
+      </w:pPr>
+      <w:r>
+        <w:rPr>
+          <w:rFonts w:ascii="Segoe UI" w:hAnsi="Segoe UI"/>
+          <w:b/>
+          <w:color w:val="1F2937"/>
+          <w:sz w:val="18"/>
+        </w:rPr>
+        <w:t xml:space="preserve">6. Laporan Efektivitas Promo: </w:t>
+      </w:r>
+      <w:r>
+        <w:rPr>
+          <w:rFonts w:ascii="Segoe UI" w:hAnsi="Segoe UI"/>
+          <w:color w:val="374151"/>
+          <w:sz w:val="18"/>
+        </w:rPr>
+        <w:t>Bandingkan nilai diskon dengan omzet dan margin yang dihasilkan tiap kampanye, untuk menentukan promo mana yang layak diulang.</w:t>
       </w:r>
     </w:p>
     <w:p>
@@ -3626,7 +3862,7 @@
                 <w:color w:val="374151"/>
                 <w:sz w:val="18"/>
               </w:rPr>
-              <w:t>Menu QR Self-Order (Web Mobile) + Panel Promo CRM</w:t>
+              <w:t>Menu QR Self-Order (Web Mobile) + Promo &amp; Voucher Panel</w:t>
             </w:r>
           </w:p>
         </w:tc>

</xml_diff>

<commit_message>
feat: add Phase 3 scale portal Mitra Investor and Owner Dashboard specifications and documentation
</commit_message>
<xml_diff>
--- a/Rekomendasi_Solusi_Teknologi_Kopi_Seduhan_Jodi.docx
+++ b/Rekomendasi_Solusi_Teknologi_Kopi_Seduhan_Jodi.docx
@@ -1596,7 +1596,7 @@
                 <w:color w:val="374151"/>
                 <w:sz w:val="18"/>
               </w:rPr>
-              <w:t>Portal Mitra / Investor</w:t>
+              <w:t>Portal Mitra Investor</w:t>
             </w:r>
           </w:p>
         </w:tc>
@@ -1629,9 +1629,9 @@
                 <w:color w:val="374151"/>
                 <w:sz w:val="18"/>
               </w:rPr>
-              <w:t>Web Portal (Secure)</w:t>
+              <w:t>Web desktop &amp; HP</w:t>
               <w:br/>
-              <w:t>(Mitra Pemilik Cabang)</w:t>
+              <w:t>(Mitra Cabang)</w:t>
             </w:r>
           </w:p>
         </w:tc>
@@ -1664,7 +1664,7 @@
                 <w:color w:val="374151"/>
                 <w:sz w:val="18"/>
               </w:rPr>
-              <w:t>Laporan real-time: omzet cabang, rincian biaya, HPP riil, dan estimasi bagi hasil.</w:t>
+              <w:t>Pantau omzet, HPP riil vs sementara, biaya outlet, dan estimasi bagi hasil transparan.</w:t>
             </w:r>
           </w:p>
         </w:tc>
@@ -1798,9 +1798,9 @@
                 <w:color w:val="374151"/>
                 <w:sz w:val="18"/>
               </w:rPr>
-              <w:t>Web / Mobile</w:t>
+              <w:t>Desktop, Tablet &amp; HP</w:t>
               <w:br/>
-              <w:t>(Owner &amp; HR)</w:t>
+              <w:t>(Direksi, HR &amp; Karyawan)</w:t>
             </w:r>
           </w:p>
         </w:tc>
@@ -1833,7 +1833,7 @@
                 <w:color w:val="374151"/>
                 <w:sz w:val="18"/>
               </w:rPr>
-              <w:t>KPI konsolidasi seluruh cabang, jadwal shift barista, &amp; absensi GPS karyawan.</w:t>
+              <w:t>KPI konsolidasi seluruh cabang, peringkat leaderboard, jadwal shift, absensi GPS &amp; slip gaji.</w:t>
             </w:r>
           </w:p>
         </w:tc>
@@ -3454,6 +3454,707 @@
     </w:p>
     <w:p>
       <w:pPr>
+        <w:spacing w:after="80"/>
+      </w:pPr>
+    </w:p>
+    <w:p>
+      <w:pPr>
+        <w:keepNext/>
+        <w:spacing w:before="200" w:after="60"/>
+      </w:pPr>
+      <w:r>
+        <w:rPr>
+          <w:rFonts w:ascii="Segoe UI" w:hAnsi="Segoe UI"/>
+          <w:b/>
+          <w:color w:val="4A2E18"/>
+          <w:sz w:val="23"/>
+        </w:rPr>
+        <w:t>Fitur Kunci Portal Mitra Investor (Fase 3 Scale):</w:t>
+      </w:r>
+    </w:p>
+    <w:p>
+      <w:pPr>
+        <w:spacing w:before="0" w:after="60" w:line="276" w:lineRule="auto"/>
+      </w:pPr>
+      <w:r>
+        <w:rPr>
+          <w:rFonts w:ascii="Segoe UI" w:hAnsi="Segoe UI"/>
+          <w:color w:val="374151"/>
+          <w:sz w:val="19"/>
+        </w:rPr>
+        <w:t>Pengguna: Investor / Mitra Cabang • Platform: Web (desktop &amp; HP)</w:t>
+        <w:br/>
+        <w:t>Mitra memantau kinerja outlet miliknya kapan saja dengan data yang transparan, tanpa menunggu laporan manual.</w:t>
+      </w:r>
+    </w:p>
+    <w:tbl>
+      <w:tblPr>
+        <w:tblW w:type="auto" w:w="0"/>
+        <w:jc w:val="center"/>
+        <w:tblLayout w:type="fixed"/>
+        <w:tblLook w:firstColumn="1" w:firstRow="1" w:lastColumn="0" w:lastRow="0" w:noHBand="0" w:noVBand="1" w:val="04A0"/>
+      </w:tblPr>
+      <w:tblGrid>
+        <w:gridCol w:w="9029"/>
+      </w:tblGrid>
+      <w:tr>
+        <w:tc>
+          <w:tcPr>
+            <w:tcW w:type="dxa" w:w="9029"/>
+            <w:shd w:fill="F0FDFA"/>
+            <w:tcMar>
+              <w:top w:w="120" w:type="dxa"/>
+              <w:bottom w:w="120" w:type="dxa"/>
+              <w:left w:w="160" w:type="dxa"/>
+              <w:right w:w="140" w:type="dxa"/>
+            </w:tcMar>
+            <w:tcBorders>
+              <w:top w:val="none"/>
+              <w:left w:val="single" w:sz="24" w:space="0" w:color="0D9488"/>
+              <w:bottom w:val="none"/>
+              <w:right w:val="none"/>
+            </w:tcBorders>
+          </w:tcPr>
+          <w:p>
+            <w:pPr>
+              <w:spacing w:before="40" w:after="60" w:line="276" w:lineRule="auto"/>
+            </w:pPr>
+            <w:r>
+              <w:rPr>
+                <w:rFonts w:ascii="Segoe UI" w:hAnsi="Segoe UI"/>
+                <w:b/>
+                <w:color w:val="3E2723"/>
+                <w:sz w:val="20"/>
+              </w:rPr>
+              <w:t>Alur Utama Portal Mitra Investor:</w:t>
+            </w:r>
+          </w:p>
+          <w:p>
+            <w:pPr>
+              <w:spacing w:before="20" w:after="40" w:line="276" w:lineRule="auto"/>
+            </w:pPr>
+            <w:r>
+              <w:rPr>
+                <w:rFonts w:ascii="Segoe UI" w:hAnsi="Segoe UI"/>
+                <w:color w:val="374151"/>
+                <w:sz w:val="19"/>
+              </w:rPr>
+              <w:t>Login Mitra → Pilih Outlet &amp; Periode → Lihat Omzet, HPP &amp; Biaya → Unduh Laporan</w:t>
+            </w:r>
+          </w:p>
+        </w:tc>
+      </w:tr>
+    </w:tbl>
+    <w:p>
+      <w:pPr>
+        <w:spacing w:after="80"/>
+      </w:pPr>
+    </w:p>
+    <w:p>
+      <w:pPr>
+        <w:pStyle w:val="ListBullet"/>
+        <w:spacing w:before="20" w:after="40" w:line="276" w:lineRule="auto"/>
+      </w:pPr>
+      <w:r>
+        <w:rPr>
+          <w:rFonts w:ascii="Segoe UI" w:hAnsi="Segoe UI"/>
+          <w:b/>
+          <w:color w:val="1F2937"/>
+          <w:sz w:val="18"/>
+        </w:rPr>
+        <w:t xml:space="preserve">1. Laporan Omzet Outlet (Hanya Baca): </w:t>
+      </w:r>
+      <w:r>
+        <w:rPr>
+          <w:rFonts w:ascii="Segoe UI" w:hAnsi="Segoe UI"/>
+          <w:color w:val="374151"/>
+          <w:sz w:val="18"/>
+        </w:rPr>
+        <w:t>Lihat omzet harian dan bulanan outlet milik mitra beserta tren penjualannya. Mitra hanya bisa melihat, tidak bisa mengubah data.</w:t>
+      </w:r>
+    </w:p>
+    <w:p>
+      <w:pPr>
+        <w:pStyle w:val="ListBullet"/>
+        <w:spacing w:before="20" w:after="40" w:line="276" w:lineRule="auto"/>
+      </w:pPr>
+      <w:r>
+        <w:rPr>
+          <w:rFonts w:ascii="Segoe UI" w:hAnsi="Segoe UI"/>
+          <w:b/>
+          <w:color w:val="1F2937"/>
+          <w:sz w:val="18"/>
+        </w:rPr>
+        <w:t xml:space="preserve">2. Hanya Outlet Milik Sendiri: </w:t>
+      </w:r>
+      <w:r>
+        <w:rPr>
+          <w:rFonts w:ascii="Segoe UI" w:hAnsi="Segoe UI"/>
+          <w:color w:val="374151"/>
+          <w:sz w:val="18"/>
+        </w:rPr>
+        <w:t>Setiap mitra hanya dapat membuka data outlet miliknya, dengan akun yang terpisah dan aman.</w:t>
+      </w:r>
+    </w:p>
+    <w:p>
+      <w:pPr>
+        <w:pStyle w:val="ListBullet"/>
+        <w:spacing w:before="20" w:after="40" w:line="276" w:lineRule="auto"/>
+      </w:pPr>
+      <w:r>
+        <w:rPr>
+          <w:rFonts w:ascii="Segoe UI" w:hAnsi="Segoe UI"/>
+          <w:b/>
+          <w:color w:val="1F2937"/>
+          <w:sz w:val="18"/>
+        </w:rPr>
+        <w:t xml:space="preserve">3. HPP Final vs Sementara: </w:t>
+      </w:r>
+      <w:r>
+        <w:rPr>
+          <w:rFonts w:ascii="Segoe UI" w:hAnsi="Segoe UI"/>
+          <w:color w:val="374151"/>
+          <w:sz w:val="18"/>
+        </w:rPr>
+        <w:t>Lihat modal bahan baku, termasuk bagian yang masih sementara (menunggu nota) dan yang sudah dikoreksi, sehingga mitra tahu angka mana yang sudah final.</w:t>
+      </w:r>
+    </w:p>
+    <w:p>
+      <w:pPr>
+        <w:pStyle w:val="ListBullet"/>
+        <w:spacing w:before="20" w:after="40" w:line="276" w:lineRule="auto"/>
+      </w:pPr>
+      <w:r>
+        <w:rPr>
+          <w:rFonts w:ascii="Segoe UI" w:hAnsi="Segoe UI"/>
+          <w:b/>
+          <w:color w:val="1F2937"/>
+          <w:sz w:val="18"/>
+        </w:rPr>
+        <w:t xml:space="preserve">4. Biaya yang Tercatat: </w:t>
+      </w:r>
+      <w:r>
+        <w:rPr>
+          <w:rFonts w:ascii="Segoe UI" w:hAnsi="Segoe UI"/>
+          <w:color w:val="374151"/>
+          <w:sz w:val="18"/>
+        </w:rPr>
+        <w:t>Rincian biaya outlet yang tercatat di sistem, seperti belanja kebutuhan kecil dan pembelian bahan.</w:t>
+      </w:r>
+    </w:p>
+    <w:p>
+      <w:pPr>
+        <w:pStyle w:val="ListBullet"/>
+        <w:spacing w:before="20" w:after="40" w:line="276" w:lineRule="auto"/>
+      </w:pPr>
+      <w:r>
+        <w:rPr>
+          <w:rFonts w:ascii="Segoe UI" w:hAnsi="Segoe UI"/>
+          <w:b/>
+          <w:color w:val="1F2937"/>
+          <w:sz w:val="18"/>
+        </w:rPr>
+        <w:t xml:space="preserve">5. Ringkasan Margin per Periode: </w:t>
+      </w:r>
+      <w:r>
+        <w:rPr>
+          <w:rFonts w:ascii="Segoe UI" w:hAnsi="Segoe UI"/>
+          <w:color w:val="374151"/>
+          <w:sz w:val="18"/>
+        </w:rPr>
+        <w:t>Penjualan dikurangi HPP dan biaya tercatat, per bulan dan per outlet.</w:t>
+      </w:r>
+    </w:p>
+    <w:p>
+      <w:pPr>
+        <w:pStyle w:val="ListBullet"/>
+        <w:spacing w:before="20" w:after="40" w:line="276" w:lineRule="auto"/>
+      </w:pPr>
+      <w:r>
+        <w:rPr>
+          <w:rFonts w:ascii="Segoe UI" w:hAnsi="Segoe UI"/>
+          <w:b/>
+          <w:color w:val="1F2937"/>
+          <w:sz w:val="18"/>
+        </w:rPr>
+        <w:t xml:space="preserve">6. Estimasi Bagi Hasil Sesuai Kesepakatan: </w:t>
+      </w:r>
+      <w:r>
+        <w:rPr>
+          <w:rFonts w:ascii="Segoe UI" w:hAnsi="Segoe UI"/>
+          <w:color w:val="374151"/>
+          <w:sz w:val="18"/>
+        </w:rPr>
+        <w:t>Perhitungan estimasi bulanan mengikuti rumus yang disepakati dengan tiap mitra.</w:t>
+      </w:r>
+    </w:p>
+    <w:p>
+      <w:pPr>
+        <w:spacing w:after="80"/>
+      </w:pPr>
+    </w:p>
+    <w:p>
+      <w:pPr>
+        <w:keepNext/>
+        <w:spacing w:before="200" w:after="60"/>
+      </w:pPr>
+      <w:r>
+        <w:rPr>
+          <w:rFonts w:ascii="Segoe UI" w:hAnsi="Segoe UI"/>
+          <w:b/>
+          <w:color w:val="4A2E18"/>
+          <w:sz w:val="23"/>
+        </w:rPr>
+        <w:t>Fitur Kunci Owner Dashboard &amp; HR (Fase 3 Scale) per Peran:</w:t>
+      </w:r>
+    </w:p>
+    <w:p>
+      <w:pPr>
+        <w:spacing w:before="0" w:after="60" w:line="276" w:lineRule="auto"/>
+      </w:pPr>
+      <w:r>
+        <w:rPr>
+          <w:rFonts w:ascii="Segoe UI" w:hAnsi="Segoe UI"/>
+          <w:color w:val="374151"/>
+          <w:sz w:val="19"/>
+        </w:rPr>
+        <w:t>Platform: Desktop &amp; Tablet (Direksi &amp; HR) • Web Mobile (Karyawan)</w:t>
+        <w:br/>
+        <w:t>Direksi memantau performa seluruh cabang dalam satu layar, sementara jadwal, absensi, dan gaji karyawan dikelola dalam satu sistem yang terhubung ke operasional outlet.</w:t>
+      </w:r>
+    </w:p>
+    <w:tbl>
+      <w:tblPr>
+        <w:tblW w:type="auto" w:w="0"/>
+        <w:jc w:val="center"/>
+        <w:tblLayout w:type="fixed"/>
+        <w:tblLook w:firstColumn="1" w:firstRow="1" w:lastColumn="0" w:lastRow="0" w:noHBand="0" w:noVBand="1" w:val="04A0"/>
+      </w:tblPr>
+      <w:tblGrid>
+        <w:gridCol w:w="9029"/>
+      </w:tblGrid>
+      <w:tr>
+        <w:tc>
+          <w:tcPr>
+            <w:tcW w:type="dxa" w:w="9029"/>
+            <w:shd w:fill="FFFBEB"/>
+            <w:tcMar>
+              <w:top w:w="120" w:type="dxa"/>
+              <w:bottom w:w="120" w:type="dxa"/>
+              <w:left w:w="160" w:type="dxa"/>
+              <w:right w:w="140" w:type="dxa"/>
+            </w:tcMar>
+            <w:tcBorders>
+              <w:top w:val="none"/>
+              <w:left w:val="single" w:sz="24" w:space="0" w:color="B45309"/>
+              <w:bottom w:val="none"/>
+              <w:right w:val="none"/>
+            </w:tcBorders>
+          </w:tcPr>
+          <w:p>
+            <w:pPr>
+              <w:spacing w:before="40" w:after="60" w:line="276" w:lineRule="auto"/>
+            </w:pPr>
+            <w:r>
+              <w:rPr>
+                <w:rFonts w:ascii="Segoe UI" w:hAnsi="Segoe UI"/>
+                <w:b/>
+                <w:color w:val="3E2723"/>
+                <w:sz w:val="20"/>
+              </w:rPr>
+              <w:t>Alur HR:</w:t>
+            </w:r>
+          </w:p>
+          <w:p>
+            <w:pPr>
+              <w:spacing w:before="20" w:after="40" w:line="276" w:lineRule="auto"/>
+            </w:pPr>
+            <w:r>
+              <w:rPr>
+                <w:rFonts w:ascii="Segoe UI" w:hAnsi="Segoe UI"/>
+                <w:color w:val="374151"/>
+                <w:sz w:val="19"/>
+              </w:rPr>
+              <w:t>Jadwal Shift → Absensi → Rekap Kehadiran → Penggajian → Slip Gaji</w:t>
+            </w:r>
+          </w:p>
+        </w:tc>
+      </w:tr>
+    </w:tbl>
+    <w:p>
+      <w:pPr>
+        <w:spacing w:after="80"/>
+      </w:pPr>
+    </w:p>
+    <w:p>
+      <w:pPr>
+        <w:keepNext/>
+        <w:spacing w:before="160" w:after="40"/>
+      </w:pPr>
+      <w:r>
+        <w:rPr>
+          <w:rFonts w:ascii="Segoe UI" w:hAnsi="Segoe UI"/>
+          <w:b/>
+          <w:color w:val="C27835"/>
+          <w:sz w:val="20"/>
+        </w:rPr>
+        <w:t>A. FOUNDER / DIREKSI (Memantau dan Memutuskan)</w:t>
+      </w:r>
+    </w:p>
+    <w:p>
+      <w:pPr>
+        <w:pStyle w:val="ListBullet"/>
+        <w:spacing w:before="20" w:after="40" w:line="276" w:lineRule="auto"/>
+      </w:pPr>
+      <w:r>
+        <w:rPr>
+          <w:rFonts w:ascii="Segoe UI" w:hAnsi="Segoe UI"/>
+          <w:b/>
+          <w:color w:val="1F2937"/>
+          <w:sz w:val="18"/>
+        </w:rPr>
+        <w:t xml:space="preserve">1. KPI Seluruh Cabang dalam Satu Layar: </w:t>
+      </w:r>
+      <w:r>
+        <w:rPr>
+          <w:rFonts w:ascii="Segoe UI" w:hAnsi="Segoe UI"/>
+          <w:color w:val="374151"/>
+          <w:sz w:val="18"/>
+        </w:rPr>
+        <w:t>Omzet, margin, jumlah pesanan, dan tren penjualan semua cabang terkonsolidasi dalam satu layar eksekutif.</w:t>
+      </w:r>
+    </w:p>
+    <w:p>
+      <w:pPr>
+        <w:pStyle w:val="ListBullet"/>
+        <w:spacing w:before="20" w:after="40" w:line="276" w:lineRule="auto"/>
+      </w:pPr>
+      <w:r>
+        <w:rPr>
+          <w:rFonts w:ascii="Segoe UI" w:hAnsi="Segoe UI"/>
+          <w:b/>
+          <w:color w:val="1F2937"/>
+          <w:sz w:val="18"/>
+        </w:rPr>
+        <w:t xml:space="preserve">2. Peringkat Cabang: </w:t>
+      </w:r>
+      <w:r>
+        <w:rPr>
+          <w:rFonts w:ascii="Segoe UI" w:hAnsi="Segoe UI"/>
+          <w:color w:val="374151"/>
+          <w:sz w:val="18"/>
+        </w:rPr>
+        <w:t>Bandingkan cabang terlaris dan margin tertinggi lewat leaderboard.</w:t>
+      </w:r>
+    </w:p>
+    <w:p>
+      <w:pPr>
+        <w:pStyle w:val="ListBullet"/>
+        <w:spacing w:before="20" w:after="40" w:line="276" w:lineRule="auto"/>
+      </w:pPr>
+      <w:r>
+        <w:rPr>
+          <w:rFonts w:ascii="Segoe UI" w:hAnsi="Segoe UI"/>
+          <w:b/>
+          <w:color w:val="1F2937"/>
+          <w:sz w:val="18"/>
+        </w:rPr>
+        <w:t xml:space="preserve">3. Pusat Persetujuan Eksekutif: </w:t>
+      </w:r>
+      <w:r>
+        <w:rPr>
+          <w:rFonts w:ascii="Segoe UI" w:hAnsi="Segoe UI"/>
+          <w:color w:val="374151"/>
+          <w:sz w:val="18"/>
+        </w:rPr>
+        <w:t>Setujui pengeluaran di atas batas dan pembelian di luar gudang pusat dari satu tempat.</w:t>
+      </w:r>
+    </w:p>
+    <w:p>
+      <w:pPr>
+        <w:pStyle w:val="ListBullet"/>
+        <w:spacing w:before="20" w:after="40" w:line="276" w:lineRule="auto"/>
+      </w:pPr>
+      <w:r>
+        <w:rPr>
+          <w:rFonts w:ascii="Segoe UI" w:hAnsi="Segoe UI"/>
+          <w:b/>
+          <w:color w:val="1F2937"/>
+          <w:sz w:val="18"/>
+        </w:rPr>
+        <w:t xml:space="preserve">4. Peringatan Penting: </w:t>
+      </w:r>
+      <w:r>
+        <w:rPr>
+          <w:rFonts w:ascii="Segoe UI" w:hAnsi="Segoe UI"/>
+          <w:color w:val="374151"/>
+          <w:sz w:val="18"/>
+        </w:rPr>
+        <w:t>Notifikasi untuk stok kritis, hutang ke pusat yang mendekati jatuh tempo, dan selisih HPP yang besar.</w:t>
+      </w:r>
+    </w:p>
+    <w:p>
+      <w:pPr>
+        <w:keepNext/>
+        <w:spacing w:before="160" w:after="40"/>
+      </w:pPr>
+      <w:r>
+        <w:rPr>
+          <w:rFonts w:ascii="Segoe UI" w:hAnsi="Segoe UI"/>
+          <w:b/>
+          <w:color w:val="C27835"/>
+          <w:sz w:val="20"/>
+        </w:rPr>
+        <w:t>B. HR / ADMIN SDM (Mengelola Karyawan dan Penggajian)</w:t>
+      </w:r>
+    </w:p>
+    <w:p>
+      <w:pPr>
+        <w:pStyle w:val="ListBullet"/>
+        <w:spacing w:before="20" w:after="40" w:line="276" w:lineRule="auto"/>
+      </w:pPr>
+      <w:r>
+        <w:rPr>
+          <w:rFonts w:ascii="Segoe UI" w:hAnsi="Segoe UI"/>
+          <w:b/>
+          <w:color w:val="1F2937"/>
+          <w:sz w:val="18"/>
+        </w:rPr>
+        <w:t xml:space="preserve">1. Data Karyawan &amp; Kontrak: </w:t>
+      </w:r>
+      <w:r>
+        <w:rPr>
+          <w:rFonts w:ascii="Segoe UI" w:hAnsi="Segoe UI"/>
+          <w:color w:val="374151"/>
+          <w:sz w:val="18"/>
+        </w:rPr>
+        <w:t>Profil, posisi, outlet penempatan, status kontrak, dan dokumen karyawan dalam satu tempat.</w:t>
+      </w:r>
+    </w:p>
+    <w:p>
+      <w:pPr>
+        <w:pStyle w:val="ListBullet"/>
+        <w:spacing w:before="20" w:after="40" w:line="276" w:lineRule="auto"/>
+      </w:pPr>
+      <w:r>
+        <w:rPr>
+          <w:rFonts w:ascii="Segoe UI" w:hAnsi="Segoe UI"/>
+          <w:b/>
+          <w:color w:val="1F2937"/>
+          <w:sz w:val="18"/>
+        </w:rPr>
+        <w:t xml:space="preserve">2. Jadwal Shift per Outlet: </w:t>
+      </w:r>
+      <w:r>
+        <w:rPr>
+          <w:rFonts w:ascii="Segoe UI" w:hAnsi="Segoe UI"/>
+          <w:color w:val="374151"/>
+          <w:sz w:val="18"/>
+        </w:rPr>
+        <w:t>Susun jadwal barista dan kasir per outlet, lengkap dengan template shift dan persetujuan tukar shift.</w:t>
+      </w:r>
+    </w:p>
+    <w:p>
+      <w:pPr>
+        <w:pStyle w:val="ListBullet"/>
+        <w:spacing w:before="20" w:after="40" w:line="276" w:lineRule="auto"/>
+      </w:pPr>
+      <w:r>
+        <w:rPr>
+          <w:rFonts w:ascii="Segoe UI" w:hAnsi="Segoe UI"/>
+          <w:b/>
+          <w:color w:val="1F2937"/>
+          <w:sz w:val="18"/>
+        </w:rPr>
+        <w:t xml:space="preserve">3. Rekap Absensi &amp; Keterlambatan: </w:t>
+      </w:r>
+      <w:r>
+        <w:rPr>
+          <w:rFonts w:ascii="Segoe UI" w:hAnsi="Segoe UI"/>
+          <w:color w:val="374151"/>
+          <w:sz w:val="18"/>
+        </w:rPr>
+        <w:t>Pantau kehadiran, keterlambatan, dan ketidakhadiran per karyawan dan per outlet.</w:t>
+      </w:r>
+    </w:p>
+    <w:p>
+      <w:pPr>
+        <w:pStyle w:val="ListBullet"/>
+        <w:spacing w:before="20" w:after="40" w:line="276" w:lineRule="auto"/>
+      </w:pPr>
+      <w:r>
+        <w:rPr>
+          <w:rFonts w:ascii="Segoe UI" w:hAnsi="Segoe UI"/>
+          <w:b/>
+          <w:color w:val="1F2937"/>
+          <w:sz w:val="18"/>
+        </w:rPr>
+        <w:t xml:space="preserve">4. Cuti, Izin &amp; Lembur: </w:t>
+      </w:r>
+      <w:r>
+        <w:rPr>
+          <w:rFonts w:ascii="Segoe UI" w:hAnsi="Segoe UI"/>
+          <w:color w:val="374151"/>
+          <w:sz w:val="18"/>
+        </w:rPr>
+        <w:t>Proses pengajuan cuti, izin, dan lembur dengan alur persetujuan yang jelas.</w:t>
+      </w:r>
+    </w:p>
+    <w:p>
+      <w:pPr>
+        <w:pStyle w:val="ListBullet"/>
+        <w:spacing w:before="20" w:after="40" w:line="276" w:lineRule="auto"/>
+      </w:pPr>
+      <w:r>
+        <w:rPr>
+          <w:rFonts w:ascii="Segoe UI" w:hAnsi="Segoe UI"/>
+          <w:b/>
+          <w:color w:val="1F2937"/>
+          <w:sz w:val="18"/>
+        </w:rPr>
+        <w:t xml:space="preserve">5. Penggajian Otomatis: </w:t>
+      </w:r>
+      <w:r>
+        <w:rPr>
+          <w:rFonts w:ascii="Segoe UI" w:hAnsi="Segoe UI"/>
+          <w:color w:val="374151"/>
+          <w:sz w:val="18"/>
+        </w:rPr>
+        <w:t>Gaji dihitung dari komponen yang ditetapkan (gaji pokok, tunjangan, lembur, potongan keterlambatan) berdasarkan data absensi.</w:t>
+      </w:r>
+    </w:p>
+    <w:p>
+      <w:pPr>
+        <w:pStyle w:val="ListBullet"/>
+        <w:spacing w:before="20" w:after="40" w:line="276" w:lineRule="auto"/>
+      </w:pPr>
+      <w:r>
+        <w:rPr>
+          <w:rFonts w:ascii="Segoe UI" w:hAnsi="Segoe UI"/>
+          <w:b/>
+          <w:color w:val="1F2937"/>
+          <w:sz w:val="18"/>
+        </w:rPr>
+        <w:t xml:space="preserve">6. Laporan SDM: </w:t>
+      </w:r>
+      <w:r>
+        <w:rPr>
+          <w:rFonts w:ascii="Segoe UI" w:hAnsi="Segoe UI"/>
+          <w:color w:val="374151"/>
+          <w:sz w:val="18"/>
+        </w:rPr>
+        <w:t>Ringkasan kehadiran, jumlah karyawan, dan biaya tenaga kerja per outlet dan per periode.</w:t>
+      </w:r>
+    </w:p>
+    <w:p>
+      <w:pPr>
+        <w:keepNext/>
+        <w:spacing w:before="160" w:after="40"/>
+      </w:pPr>
+      <w:r>
+        <w:rPr>
+          <w:rFonts w:ascii="Segoe UI" w:hAnsi="Segoe UI"/>
+          <w:b/>
+          <w:color w:val="C27835"/>
+          <w:sz w:val="20"/>
+        </w:rPr>
+        <w:t>C. KARYAWAN (Barista &amp; Kasir - Mengurus Kebutuhan Kerja dari HP)</w:t>
+      </w:r>
+    </w:p>
+    <w:p>
+      <w:pPr>
+        <w:pStyle w:val="ListBullet"/>
+        <w:spacing w:before="20" w:after="40" w:line="276" w:lineRule="auto"/>
+      </w:pPr>
+      <w:r>
+        <w:rPr>
+          <w:rFonts w:ascii="Segoe UI" w:hAnsi="Segoe UI"/>
+          <w:b/>
+          <w:color w:val="1F2937"/>
+          <w:sz w:val="18"/>
+        </w:rPr>
+        <w:t xml:space="preserve">1. Absen dengan GPS &amp; Foto: </w:t>
+      </w:r>
+      <w:r>
+        <w:rPr>
+          <w:rFonts w:ascii="Segoe UI" w:hAnsi="Segoe UI"/>
+          <w:color w:val="374151"/>
+          <w:sz w:val="18"/>
+        </w:rPr>
+        <w:t>Absen masuk dan pulang hanya bisa dilakukan di area outlet, dilengkapi foto selfie untuk mencegah titip absen.</w:t>
+      </w:r>
+    </w:p>
+    <w:p>
+      <w:pPr>
+        <w:pStyle w:val="ListBullet"/>
+        <w:spacing w:before="20" w:after="40" w:line="276" w:lineRule="auto"/>
+      </w:pPr>
+      <w:r>
+        <w:rPr>
+          <w:rFonts w:ascii="Segoe UI" w:hAnsi="Segoe UI"/>
+          <w:b/>
+          <w:color w:val="1F2937"/>
+          <w:sz w:val="18"/>
+        </w:rPr>
+        <w:t xml:space="preserve">2. Lihat Jadwal Shift: </w:t>
+      </w:r>
+      <w:r>
+        <w:rPr>
+          <w:rFonts w:ascii="Segoe UI" w:hAnsi="Segoe UI"/>
+          <w:color w:val="374151"/>
+          <w:sz w:val="18"/>
+        </w:rPr>
+        <w:t>Lihat jadwal kerja pribadi kapan saja.</w:t>
+      </w:r>
+    </w:p>
+    <w:p>
+      <w:pPr>
+        <w:pStyle w:val="ListBullet"/>
+        <w:spacing w:before="20" w:after="40" w:line="276" w:lineRule="auto"/>
+      </w:pPr>
+      <w:r>
+        <w:rPr>
+          <w:rFonts w:ascii="Segoe UI" w:hAnsi="Segoe UI"/>
+          <w:b/>
+          <w:color w:val="1F2937"/>
+          <w:sz w:val="18"/>
+        </w:rPr>
+        <w:t xml:space="preserve">3. Ajukan Cuti, Izin &amp; Tukar Shift: </w:t>
+      </w:r>
+      <w:r>
+        <w:rPr>
+          <w:rFonts w:ascii="Segoe UI" w:hAnsi="Segoe UI"/>
+          <w:color w:val="374151"/>
+          <w:sz w:val="18"/>
+        </w:rPr>
+        <w:t>Ajukan langsung dari HP dan pantau statusnya.</w:t>
+      </w:r>
+    </w:p>
+    <w:p>
+      <w:pPr>
+        <w:pStyle w:val="ListBullet"/>
+        <w:spacing w:before="20" w:after="40" w:line="276" w:lineRule="auto"/>
+      </w:pPr>
+      <w:r>
+        <w:rPr>
+          <w:rFonts w:ascii="Segoe UI" w:hAnsi="Segoe UI"/>
+          <w:b/>
+          <w:color w:val="1F2937"/>
+          <w:sz w:val="18"/>
+        </w:rPr>
+        <w:t xml:space="preserve">4. Slip Gaji Digital: </w:t>
+      </w:r>
+      <w:r>
+        <w:rPr>
+          <w:rFonts w:ascii="Segoe UI" w:hAnsi="Segoe UI"/>
+          <w:color w:val="374151"/>
+          <w:sz w:val="18"/>
+        </w:rPr>
+        <w:t>Lihat rincian gaji bulanan tanpa perlu menunggu slip cetak.</w:t>
+      </w:r>
+    </w:p>
+    <w:p>
+      <w:pPr>
         <w:keepNext/>
         <w:spacing w:before="280" w:after="100"/>
         <w:pBdr>
@@ -3996,7 +4697,7 @@
                 <w:color w:val="374151"/>
                 <w:sz w:val="18"/>
               </w:rPr>
-              <w:t>Portal Mitra/Investor + Owner Dashboard &amp; HR Shift</w:t>
+              <w:t>Portal Mitra Investor + Owner Dashboard &amp; HR</w:t>
             </w:r>
           </w:p>
         </w:tc>

</xml_diff>

<commit_message>
docs: add documentation, proposal app, and ecosystem assets for Kopi Jodi
</commit_message>
<xml_diff>
--- a/Rekomendasi_Solusi_Teknologi_Kopi_Seduhan_Jodi.docx
+++ b/Rekomendasi_Solusi_Teknologi_Kopi_Seduhan_Jodi.docx
@@ -4730,7 +4730,7 @@
                 <w:color w:val="374151"/>
                 <w:sz w:val="18"/>
               </w:rPr>
-              <w:t>1 - 1.5 Bulan</w:t>
+              <w:t>2 – 2.5 Bulan</w:t>
             </w:r>
           </w:p>
         </w:tc>
@@ -4763,7 +4763,7 @@
                 <w:color w:val="374151"/>
                 <w:sz w:val="18"/>
               </w:rPr>
-              <w:t>Rp 27.000.000,-</w:t>
+              <w:t>Menyusul (TBA)</w:t>
             </w:r>
           </w:p>
         </w:tc>
@@ -4835,7 +4835,7 @@
                 <w:color w:val="374151"/>
                 <w:sz w:val="18"/>
               </w:rPr>
-              <w:t>Seluruh Ekosistem Lengkap (Diskon Khusus Rp 15 Juta)</w:t>
+              <w:t>Seluruh Ekosistem Lengkap</w:t>
             </w:r>
           </w:p>
         </w:tc>
@@ -4869,7 +4869,7 @@
                 <w:color w:val="374151"/>
                 <w:sz w:val="18"/>
               </w:rPr>
-              <w:t>± 6 Bulan</w:t>
+              <w:t>± 6.5 – 7 Bulan</w:t>
             </w:r>
           </w:p>
         </w:tc>
@@ -4903,9 +4903,7 @@
                 <w:color w:val="374151"/>
                 <w:sz w:val="18"/>
               </w:rPr>
-              <w:t>Rp 135.000.000,-</w:t>
-              <w:br/>
-              <w:t>(Net)</w:t>
+              <w:t>Menyusul (TBA)</w:t>
             </w:r>
           </w:p>
         </w:tc>
@@ -8460,7 +8458,7 @@
               </w:rPr>
               <w:t>OPSI 1: Beli Putus - Paket Bundling (Fase 1 + 2 + 3)</w:t>
               <w:br/>
-              <w:t>Investasi: Rp 135.000.000,- (Hemat Rp 15 Juta)</w:t>
+              <w:t>Investasi: Menyusul (TBA)</w:t>
             </w:r>
           </w:p>
         </w:tc>

</xml_diff>

<commit_message>
feat: add ProposalApp component for generating system architecture and pricing proposal UI
</commit_message>
<xml_diff>
--- a/Rekomendasi_Solusi_Teknologi_Kopi_Seduhan_Jodi.docx
+++ b/Rekomendasi_Solusi_Teknologi_Kopi_Seduhan_Jodi.docx
@@ -5187,7 +5187,7 @@
           </w:tcPr>
           <w:p>
             <w:r>
-              <w:t>Selesai per milestone fase (~3 - 6 bulan)</w:t>
+              <w:t>Selesai per milestone fase (Total ± 6.5 – 7 Bulan)</w:t>
             </w:r>
           </w:p>
         </w:tc>
@@ -5219,7 +5219,7 @@
           </w:tcPr>
           <w:p>
             <w:r>
-              <w:t>Garansi 3 - 6 bulan (setelahnya kontrak terpisah)</w:t>
+              <w:t>Garansi bug 6 bulan penuh (setelahnya kontrak terpisah)</w:t>
             </w:r>
           </w:p>
         </w:tc>

</xml_diff>